<commit_message>
Updated Doc with new I2C Device and added ESTOP subsystem to Schematic
</commit_message>
<xml_diff>
--- a/BILLEE_Rover_Control_Module_V1/PDB_Engineering_Requirements_and_Design_Guide_Rev_G.docx
+++ b/BILLEE_Rover_Control_Module_V1/PDB_Engineering_Requirements_and_Design_Guide_Rev_G.docx
@@ -129,7 +129,21 @@
               <w:rPr>
                 <w:sz w:val="16"/>
               </w:rPr>
-              <w:t>Replaced onboard RP2040/Pico concept with bare RP2350A baseline controller. Updated GPIO allocation, I2C topology, Zephyr bindings, KiCad sheet plan, and LCSC part list. Kept six drivetrain MOSFET branches and split ARM/SCIENCE rails. Removed MCP23017 from baseline.</w:t>
+              <w:t xml:space="preserve">Replaced onboard RP2040/Pico concept with bare RP2350A baseline controller. Updated GPIO allocation, I2C topology, Zephyr bindings, </w:t>
+            </w:r>
+            <w:proofErr w:type="spellStart"/>
+            <w:r>
+              <w:rPr>
+                <w:sz w:val="16"/>
+              </w:rPr>
+              <w:t>KiCad</w:t>
+            </w:r>
+            <w:proofErr w:type="spellEnd"/>
+            <w:r>
+              <w:rPr>
+                <w:sz w:val="16"/>
+              </w:rPr>
+              <w:t xml:space="preserve"> sheet plan, and LCSC part list. Kept six drivetrain MOSFET branches and split ARM/SCIENCE rails. Removed MCP23017 from baseline.</w:t>
             </w:r>
           </w:p>
         </w:tc>
@@ -218,7 +232,15 @@
         <w:spacing w:after="60"/>
       </w:pPr>
       <w:r>
-        <w:t>8. KiCad Schematic Sheet Plan</w:t>
+        <w:t xml:space="preserve">8. </w:t>
+      </w:r>
+      <w:proofErr w:type="spellStart"/>
+      <w:r>
+        <w:t>KiCad</w:t>
+      </w:r>
+      <w:proofErr w:type="spellEnd"/>
+      <w:r>
+        <w:t xml:space="preserve"> Schematic Sheet Plan</w:t>
       </w:r>
     </w:p>
     <w:p>
@@ -281,7 +303,15 @@
         <w:spacing w:after="60"/>
       </w:pPr>
       <w:r>
-        <w:t>Use Sections 2 and 3 to teach the architecture before opening KiCad.</w:t>
+        <w:t xml:space="preserve">Use Sections 2 and 3 to teach the architecture before opening </w:t>
+      </w:r>
+      <w:proofErr w:type="spellStart"/>
+      <w:r>
+        <w:t>KiCad</w:t>
+      </w:r>
+      <w:proofErr w:type="spellEnd"/>
+      <w:r>
+        <w:t>.</w:t>
       </w:r>
     </w:p>
     <w:p>
@@ -389,7 +419,15 @@
         <w:spacing w:after="60"/>
       </w:pPr>
       <w:r>
-        <w:t>The schematic shall follow the Raspberry Pi RP2350 hardware design guide and the Bronco Space Lab BLVLink hardware v2.0 reference design for RP2350 support circuitry.</w:t>
+        <w:t xml:space="preserve">The schematic shall follow the Raspberry Pi RP2350 hardware design guide and the Bronco Space Lab </w:t>
+      </w:r>
+      <w:proofErr w:type="spellStart"/>
+      <w:r>
+        <w:t>BLVLink</w:t>
+      </w:r>
+      <w:proofErr w:type="spellEnd"/>
+      <w:r>
+        <w:t xml:space="preserve"> hardware v2.0 reference design for RP2350 support circuitry.</w:t>
       </w:r>
     </w:p>
     <w:p>
@@ -781,7 +819,15 @@
         <w:spacing w:after="60"/>
       </w:pPr>
       <w:r>
-        <w:t>Each drivetrain branch shall have one dedicated native RP2350 DRIVE_EN_x GPIO.</w:t>
+        <w:t xml:space="preserve">Each drivetrain branch shall have one dedicated native RP2350 </w:t>
+      </w:r>
+      <w:proofErr w:type="spellStart"/>
+      <w:r>
+        <w:t>DRIVE_EN_x</w:t>
+      </w:r>
+      <w:proofErr w:type="spellEnd"/>
+      <w:r>
+        <w:t xml:space="preserve"> GPIO.</w:t>
       </w:r>
     </w:p>
     <w:p>
@@ -790,7 +836,15 @@
         <w:spacing w:after="60"/>
       </w:pPr>
       <w:r>
-        <w:t>Each DRIVE_EN_x signal shall pass through the GPIO buffer and E-stop gate before reaching the gate-driver input.</w:t>
+        <w:t xml:space="preserve">Each </w:t>
+      </w:r>
+      <w:proofErr w:type="spellStart"/>
+      <w:r>
+        <w:t>DRIVE_EN_x</w:t>
+      </w:r>
+      <w:proofErr w:type="spellEnd"/>
+      <w:r>
+        <w:t xml:space="preserve"> signal shall pass through the GPIO buffer and E-stop gate before reaching the gate-driver input.</w:t>
       </w:r>
     </w:p>
     <w:p>
@@ -1006,7 +1060,15 @@
         <w:spacing w:after="60"/>
       </w:pPr>
       <w:r>
-        <w:t>The GPIO buffer and AND gates shall be powered from the 3.3 V housekeeping rail.</w:t>
+        <w:t xml:space="preserve">The GPIO buffer and </w:t>
+      </w:r>
+      <w:proofErr w:type="spellStart"/>
+      <w:r>
+        <w:t>AND</w:t>
+      </w:r>
+      <w:proofErr w:type="spellEnd"/>
+      <w:r>
+        <w:t xml:space="preserve"> gates shall be powered from the 3.3 V housekeeping rail.</w:t>
       </w:r>
     </w:p>
     <w:p>
@@ -1150,7 +1212,15 @@
         <w:spacing w:after="60"/>
       </w:pPr>
       <w:r>
-        <w:t>For each branch x = 1..6:</w:t>
+        <w:t xml:space="preserve">For each branch x = </w:t>
+      </w:r>
+      <w:proofErr w:type="gramStart"/>
+      <w:r>
+        <w:t>1..</w:t>
+      </w:r>
+      <w:proofErr w:type="gramEnd"/>
+      <w:r>
+        <w:t>6:</w:t>
       </w:r>
       <w:r>
         <w:br/>
@@ -1207,15 +1277,28 @@
         <w:spacing w:after="60"/>
       </w:pPr>
       <w:r>
-        <w:t>For each branch x = 1..6:</w:t>
+        <w:t xml:space="preserve">For each branch x = </w:t>
+      </w:r>
+      <w:proofErr w:type="gramStart"/>
+      <w:r>
+        <w:t>1..</w:t>
+      </w:r>
+      <w:proofErr w:type="gramEnd"/>
+      <w:r>
+        <w:t>6:</w:t>
       </w:r>
       <w:r>
         <w:br/>
       </w:r>
       <w:r>
         <w:br/>
-        <w:t>RP2350 DRIVE_EN_x</w:t>
-      </w:r>
+        <w:t xml:space="preserve">RP2350 </w:t>
+      </w:r>
+      <w:proofErr w:type="spellStart"/>
+      <w:r>
+        <w:t>DRIVE_EN_x</w:t>
+      </w:r>
+      <w:proofErr w:type="spellEnd"/>
       <w:r>
         <w:br/>
         <w:t xml:space="preserve">   |</w:t>
@@ -2336,11 +2419,27 @@
             </w:r>
             <w:r>
               <w:br/>
-              <w:t xml:space="preserve">Since this mosfet after about ~8v reaches its </w:t>
+              <w:t xml:space="preserve">Since this </w:t>
+            </w:r>
+            <w:proofErr w:type="spellStart"/>
+            <w:r>
+              <w:t>mosfet</w:t>
+            </w:r>
+            <w:proofErr w:type="spellEnd"/>
+            <w:r>
+              <w:t xml:space="preserve"> after about ~8v reaches its </w:t>
             </w:r>
             <w:r>
               <w:lastRenderedPageBreak/>
-              <w:t>“peak” current capabilities, you can set the vcc of this to be on the 12v rail output</w:t>
+              <w:t xml:space="preserve">“peak” current capabilities, you can set the </w:t>
+            </w:r>
+            <w:proofErr w:type="spellStart"/>
+            <w:r>
+              <w:t>vcc</w:t>
+            </w:r>
+            <w:proofErr w:type="spellEnd"/>
+            <w:r>
+              <w:t xml:space="preserve"> of this to be on the 12v rail output</w:t>
             </w:r>
           </w:p>
         </w:tc>
@@ -2731,7 +2830,15 @@
               <w:br/>
             </w:r>
             <w:r>
-              <w:t>Jetson power + networkswitch + POE will use screw terminal blocks</w:t>
+              <w:t xml:space="preserve">Jetson power + </w:t>
+            </w:r>
+            <w:proofErr w:type="spellStart"/>
+            <w:r>
+              <w:t>networkswitch</w:t>
+            </w:r>
+            <w:proofErr w:type="spellEnd"/>
+            <w:r>
+              <w:t xml:space="preserve"> + POE will use screw terminal blocks</w:t>
             </w:r>
           </w:p>
         </w:tc>
@@ -3916,6 +4023,83 @@
             <w:tcW w:w="1152" w:type="dxa"/>
           </w:tcPr>
           <w:p>
+            <w:pPr>
+              <w:rPr>
+                <w:sz w:val="16"/>
+              </w:rPr>
+            </w:pPr>
+            <w:r>
+              <w:rPr>
+                <w:sz w:val="16"/>
+              </w:rPr>
+              <w:t>I2C0</w:t>
+            </w:r>
+          </w:p>
+        </w:tc>
+        <w:tc>
+          <w:tcPr>
+            <w:tcW w:w="3024" w:type="dxa"/>
+          </w:tcPr>
+          <w:p>
+            <w:pPr>
+              <w:rPr>
+                <w:sz w:val="16"/>
+              </w:rPr>
+            </w:pPr>
+            <w:r>
+              <w:rPr>
+                <w:sz w:val="16"/>
+              </w:rPr>
+              <w:t>INA780x Logic</w:t>
+            </w:r>
+          </w:p>
+        </w:tc>
+        <w:tc>
+          <w:tcPr>
+            <w:tcW w:w="1584" w:type="dxa"/>
+          </w:tcPr>
+          <w:p>
+            <w:pPr>
+              <w:rPr>
+                <w:sz w:val="16"/>
+              </w:rPr>
+            </w:pPr>
+            <w:r>
+              <w:rPr>
+                <w:sz w:val="16"/>
+              </w:rPr>
+              <w:t>0x4F</w:t>
+            </w:r>
+          </w:p>
+        </w:tc>
+        <w:tc>
+          <w:tcPr>
+            <w:tcW w:w="4896" w:type="dxa"/>
+          </w:tcPr>
+          <w:p>
+            <w:pPr>
+              <w:rPr>
+                <w:sz w:val="16"/>
+              </w:rPr>
+            </w:pPr>
+            <w:r>
+              <w:rPr>
+                <w:sz w:val="16"/>
+              </w:rPr>
+              <w:t>A1=SCL, A0=SCL</w:t>
+            </w:r>
+          </w:p>
+        </w:tc>
+      </w:tr>
+      <w:tr>
+        <w:trPr>
+          <w:jc w:val="center"/>
+        </w:trPr>
+        <w:tc>
+          <w:tcPr>
+            <w:tcW w:w="1152" w:type="dxa"/>
+          </w:tcPr>
+          <w:p>
             <w:r>
               <w:rPr>
                 <w:sz w:val="16"/>
@@ -4903,6 +5087,12 @@
               </w:rPr>
               <w:t>SPARE_EN</w:t>
             </w:r>
+            <w:r>
+              <w:rPr>
+                <w:sz w:val="16"/>
+              </w:rPr>
+              <w:t xml:space="preserve"> (NOT NEEDED)</w:t>
+            </w:r>
           </w:p>
         </w:tc>
         <w:tc>
@@ -4932,6 +5122,7 @@
               <w:rPr>
                 <w:sz w:val="16"/>
               </w:rPr>
+              <w:lastRenderedPageBreak/>
               <w:t>GPIO14</w:t>
             </w:r>
           </w:p>
@@ -4976,7 +5167,6 @@
               <w:rPr>
                 <w:sz w:val="16"/>
               </w:rPr>
-              <w:lastRenderedPageBreak/>
               <w:t>GPIO15</w:t>
             </w:r>
           </w:p>
@@ -5636,7 +5826,15 @@
         <w:spacing w:before="160" w:after="80"/>
       </w:pPr>
       <w:r>
-        <w:t>6.3 Buffer and AND Gate Channel Use</w:t>
+        <w:t xml:space="preserve">6.3 Buffer and </w:t>
+      </w:r>
+      <w:proofErr w:type="spellStart"/>
+      <w:r>
+        <w:t>AND</w:t>
+      </w:r>
+      <w:proofErr w:type="spellEnd"/>
+      <w:r>
+        <w:t xml:space="preserve"> Gate Channel Use</w:t>
       </w:r>
     </w:p>
     <w:tbl>
@@ -5712,6 +5910,7 @@
             <w:vAlign w:val="center"/>
           </w:tcPr>
           <w:p>
+            <w:proofErr w:type="gramStart"/>
             <w:r>
               <w:rPr>
                 <w:b/>
@@ -5719,6 +5918,7 @@
               </w:rPr>
               <w:t>Final destination</w:t>
             </w:r>
+            <w:proofErr w:type="gramEnd"/>
           </w:p>
         </w:tc>
       </w:tr>
@@ -6331,7 +6531,15 @@
         <w:spacing w:after="60"/>
       </w:pPr>
       <w:r>
-        <w:t>All final enable lines shall have local pulldowns so power stages default OFF when logic is unpowered.</w:t>
+        <w:t xml:space="preserve">All final enable lines shall have local </w:t>
+      </w:r>
+      <w:proofErr w:type="gramStart"/>
+      <w:r>
+        <w:t>pulldowns</w:t>
+      </w:r>
+      <w:proofErr w:type="gramEnd"/>
+      <w:r>
+        <w:t xml:space="preserve"> so power stages default OFF when logic is unpowered.</w:t>
       </w:r>
     </w:p>
     <w:p>
@@ -6399,22 +6607,53 @@
       </w:r>
       <w:r>
         <w:br/>
-        <w:t xml:space="preserve">  temp_logic     @ 0x18</w:t>
+        <w:t xml:space="preserve">  </w:t>
+      </w:r>
+      <w:proofErr w:type="spellStart"/>
+      <w:r>
+        <w:t>temp_logic</w:t>
+      </w:r>
+      <w:proofErr w:type="spellEnd"/>
+      <w:r>
+        <w:t xml:space="preserve">     @ 0x18</w:t>
       </w:r>
       <w:r>
         <w:br/>
-        <w:t xml:space="preserve">  temp_drive     @ 0x19</w:t>
+        <w:t xml:space="preserve">  </w:t>
+      </w:r>
+      <w:proofErr w:type="spellStart"/>
+      <w:r>
+        <w:t>temp_drive</w:t>
+      </w:r>
+      <w:proofErr w:type="spellEnd"/>
+      <w:r>
+        <w:t xml:space="preserve">     @ 0x19</w:t>
       </w:r>
       <w:r>
         <w:br/>
-        <w:t xml:space="preserve">  temp_arm_sci   @ 0x1A</w:t>
+        <w:t xml:space="preserve">  </w:t>
+      </w:r>
+      <w:proofErr w:type="spellStart"/>
+      <w:r>
+        <w:t>temp_arm_sci</w:t>
+      </w:r>
+      <w:proofErr w:type="spellEnd"/>
+      <w:r>
+        <w:t xml:space="preserve">   @ 0x1A</w:t>
       </w:r>
       <w:r>
         <w:br/>
       </w:r>
       <w:r>
         <w:br/>
-        <w:t>gpio outputs:</w:t>
+      </w:r>
+      <w:proofErr w:type="spellStart"/>
+      <w:r>
+        <w:t>gpio</w:t>
+      </w:r>
+      <w:proofErr w:type="spellEnd"/>
+      <w:r>
+        <w:t xml:space="preserve"> outputs:</w:t>
       </w:r>
       <w:r>
         <w:br/>
@@ -6422,56 +6661,105 @@
       </w:r>
       <w:r>
         <w:br/>
-        <w:t xml:space="preserve">  arm_en</w:t>
-      </w:r>
+        <w:t xml:space="preserve">  </w:t>
+      </w:r>
+      <w:proofErr w:type="spellStart"/>
+      <w:r>
+        <w:t>arm_en</w:t>
+      </w:r>
+      <w:proofErr w:type="spellEnd"/>
       <w:r>
         <w:br/>
-        <w:t xml:space="preserve">  science_en</w:t>
-      </w:r>
+        <w:t xml:space="preserve">  </w:t>
+      </w:r>
+      <w:proofErr w:type="spellStart"/>
+      <w:r>
+        <w:t>science_en</w:t>
+      </w:r>
+      <w:proofErr w:type="spellEnd"/>
       <w:r>
         <w:br/>
         <w:t xml:space="preserve">  aux_22_en</w:t>
       </w:r>
       <w:r>
         <w:br/>
-        <w:t xml:space="preserve">  pdb_fault_out</w:t>
-      </w:r>
+        <w:t xml:space="preserve">  </w:t>
+      </w:r>
+      <w:proofErr w:type="spellStart"/>
+      <w:r>
+        <w:t>pdb_fault_out</w:t>
+      </w:r>
+      <w:proofErr w:type="spellEnd"/>
       <w:r>
         <w:br/>
         <w:t xml:space="preserve">  tca4307_i2c0_en</w:t>
       </w:r>
       <w:r>
         <w:br/>
+      </w:r>
+      <w:r>
+        <w:lastRenderedPageBreak/>
         <w:t xml:space="preserve">  tca4307_i2c1_en</w:t>
       </w:r>
       <w:r>
         <w:br/>
       </w:r>
       <w:r>
-        <w:lastRenderedPageBreak/>
         <w:br/>
-        <w:t>gpio inputs:</w:t>
+      </w:r>
+      <w:proofErr w:type="spellStart"/>
+      <w:r>
+        <w:t>gpio</w:t>
+      </w:r>
+      <w:proofErr w:type="spellEnd"/>
+      <w:r>
+        <w:t xml:space="preserve"> inputs:</w:t>
       </w:r>
       <w:r>
         <w:br/>
-        <w:t xml:space="preserve">  e_stop_status</w:t>
-      </w:r>
+        <w:t xml:space="preserve">  </w:t>
+      </w:r>
+      <w:proofErr w:type="spellStart"/>
+      <w:r>
+        <w:t>e_stop_status</w:t>
+      </w:r>
+      <w:proofErr w:type="spellEnd"/>
       <w:r>
         <w:br/>
-        <w:t xml:space="preserve">  jetson_heartbeat_in</w:t>
-      </w:r>
+        <w:t xml:space="preserve">  </w:t>
+      </w:r>
+      <w:proofErr w:type="spellStart"/>
+      <w:r>
+        <w:t>jetson_heartbeat_in</w:t>
+      </w:r>
+      <w:proofErr w:type="spellEnd"/>
       <w:r>
         <w:br/>
-        <w:t xml:space="preserve">  drive_fault_sum_in</w:t>
-      </w:r>
+        <w:t xml:space="preserve">  </w:t>
+      </w:r>
+      <w:proofErr w:type="spellStart"/>
+      <w:r>
+        <w:t>drive_fault_sum_in</w:t>
+      </w:r>
+      <w:proofErr w:type="spellEnd"/>
       <w:r>
         <w:br/>
-        <w:t xml:space="preserve">  arm_sci_fault_sum_in</w:t>
-      </w:r>
+        <w:t xml:space="preserve">  </w:t>
+      </w:r>
+      <w:proofErr w:type="spellStart"/>
+      <w:r>
+        <w:t>arm_sci_fault_sum_in</w:t>
+      </w:r>
+      <w:proofErr w:type="spellEnd"/>
       <w:r>
         <w:br/>
-        <w:t xml:space="preserve">  logic_fault_in</w:t>
-      </w:r>
+        <w:t xml:space="preserve">  </w:t>
+      </w:r>
+      <w:proofErr w:type="spellStart"/>
+      <w:r>
+        <w:t>logic_fault_in</w:t>
+      </w:r>
+      <w:proofErr w:type="spellEnd"/>
     </w:p>
     <w:p>
       <w:pPr>
@@ -6738,8 +7026,13 @@
         <w:spacing w:before="160" w:after="80"/>
       </w:pPr>
       <w:r>
-        <w:t>7.2 Recommended Stackup</w:t>
-      </w:r>
+        <w:t xml:space="preserve">7.2 Recommended </w:t>
+      </w:r>
+      <w:proofErr w:type="spellStart"/>
+      <w:r>
+        <w:t>Stackup</w:t>
+      </w:r>
+      <w:proofErr w:type="spellEnd"/>
     </w:p>
     <w:p>
       <w:pPr>
@@ -7179,7 +7472,15 @@
       </w:pPr>
       <w:r>
         <w:lastRenderedPageBreak/>
-        <w:t>8. KiCad Schematic Sheet Plan</w:t>
+        <w:t xml:space="preserve">8. </w:t>
+      </w:r>
+      <w:proofErr w:type="spellStart"/>
+      <w:r>
+        <w:t>KiCad</w:t>
+      </w:r>
+      <w:proofErr w:type="spellEnd"/>
+      <w:r>
+        <w:t xml:space="preserve"> Schematic Sheet Plan</w:t>
       </w:r>
     </w:p>
     <w:tbl>
@@ -7639,7 +7940,15 @@
         <w:spacing w:after="60"/>
       </w:pPr>
       <w:r>
-        <w:t>Firmware shall support Zephyr on RP2350A or a custom board target derived from Raspberry Pi Pico 2 / RP2350A support.</w:t>
+        <w:t xml:space="preserve">Firmware shall support Zephyr on </w:t>
+      </w:r>
+      <w:proofErr w:type="gramStart"/>
+      <w:r>
+        <w:t>RP2350A</w:t>
+      </w:r>
+      <w:proofErr w:type="gramEnd"/>
+      <w:r>
+        <w:t xml:space="preserve"> or a custom board target derived from Raspberry Pi Pico 2 / RP2350A support.</w:t>
       </w:r>
     </w:p>
     <w:p>
@@ -8024,51 +8333,123 @@
       </w:r>
       <w:r>
         <w:br/>
-        <w:t>faults clear</w:t>
+      </w:r>
+      <w:proofErr w:type="spellStart"/>
+      <w:r>
+        <w:t>faults</w:t>
+      </w:r>
+      <w:proofErr w:type="spellEnd"/>
+      <w:r>
+        <w:t xml:space="preserve"> clear</w:t>
       </w:r>
       <w:r>
         <w:br/>
-        <w:t>rail drive1 on|off</w:t>
-      </w:r>
+        <w:t xml:space="preserve">rail drive1 </w:t>
+      </w:r>
+      <w:proofErr w:type="spellStart"/>
+      <w:r>
+        <w:t>on|off</w:t>
+      </w:r>
+      <w:proofErr w:type="spellEnd"/>
       <w:r>
         <w:br/>
-        <w:t>rail drive2 on|off</w:t>
-      </w:r>
+        <w:t xml:space="preserve">rail drive2 </w:t>
+      </w:r>
+      <w:proofErr w:type="spellStart"/>
+      <w:r>
+        <w:t>on|off</w:t>
+      </w:r>
+      <w:proofErr w:type="spellEnd"/>
       <w:r>
         <w:br/>
-        <w:t>rail drive3 on|off</w:t>
-      </w:r>
+        <w:t xml:space="preserve">rail drive3 </w:t>
+      </w:r>
+      <w:proofErr w:type="spellStart"/>
+      <w:r>
+        <w:t>on|off</w:t>
+      </w:r>
+      <w:proofErr w:type="spellEnd"/>
       <w:r>
         <w:br/>
-        <w:t>rail drive4 on|off</w:t>
-      </w:r>
+        <w:t xml:space="preserve">rail drive4 </w:t>
+      </w:r>
+      <w:proofErr w:type="spellStart"/>
+      <w:r>
+        <w:t>on|off</w:t>
+      </w:r>
+      <w:proofErr w:type="spellEnd"/>
       <w:r>
         <w:br/>
-        <w:t>rail drive5 on|off</w:t>
-      </w:r>
+        <w:t xml:space="preserve">rail drive5 </w:t>
+      </w:r>
+      <w:proofErr w:type="spellStart"/>
+      <w:r>
+        <w:t>on|off</w:t>
+      </w:r>
+      <w:proofErr w:type="spellEnd"/>
       <w:r>
         <w:br/>
-        <w:t>rail drive6 on|off</w:t>
-      </w:r>
+        <w:t xml:space="preserve">rail drive6 </w:t>
+      </w:r>
+      <w:proofErr w:type="spellStart"/>
+      <w:r>
+        <w:t>on|off</w:t>
+      </w:r>
+      <w:proofErr w:type="spellEnd"/>
       <w:r>
         <w:br/>
-        <w:t>rail drive_all on|off</w:t>
-      </w:r>
+        <w:t xml:space="preserve">rail </w:t>
+      </w:r>
+      <w:proofErr w:type="spellStart"/>
+      <w:r>
+        <w:t>drive_all</w:t>
+      </w:r>
+      <w:proofErr w:type="spellEnd"/>
+      <w:r>
+        <w:t xml:space="preserve"> </w:t>
+      </w:r>
+      <w:proofErr w:type="spellStart"/>
+      <w:r>
+        <w:t>on|off</w:t>
+      </w:r>
+      <w:proofErr w:type="spellEnd"/>
       <w:r>
         <w:br/>
-        <w:t>rail arm on|off</w:t>
-      </w:r>
+        <w:t xml:space="preserve">rail arm </w:t>
+      </w:r>
+      <w:proofErr w:type="spellStart"/>
+      <w:r>
+        <w:t>on|off</w:t>
+      </w:r>
+      <w:proofErr w:type="spellEnd"/>
       <w:r>
         <w:br/>
-        <w:t>rail science on|off</w:t>
-      </w:r>
+        <w:t xml:space="preserve">rail science </w:t>
+      </w:r>
+      <w:proofErr w:type="spellStart"/>
+      <w:r>
+        <w:t>on|off</w:t>
+      </w:r>
+      <w:proofErr w:type="spellEnd"/>
       <w:r>
         <w:br/>
-        <w:t>rail aux22 on|off</w:t>
-      </w:r>
+        <w:t xml:space="preserve">rail aux22 </w:t>
+      </w:r>
+      <w:proofErr w:type="spellStart"/>
+      <w:r>
+        <w:t>on|off</w:t>
+      </w:r>
+      <w:proofErr w:type="spellEnd"/>
       <w:r>
         <w:br/>
-        <w:t>high_power disable</w:t>
+      </w:r>
+      <w:proofErr w:type="spellStart"/>
+      <w:r>
+        <w:t>high_power</w:t>
+      </w:r>
+      <w:proofErr w:type="spellEnd"/>
+      <w:r>
+        <w:t xml:space="preserve"> disable</w:t>
       </w:r>
       <w:r>
         <w:br/>
@@ -8076,8 +8457,12 @@
       </w:r>
       <w:r>
         <w:br/>
+      </w:r>
+      <w:proofErr w:type="spellStart"/>
+      <w:r>
         <w:t>reboot_controller</w:t>
       </w:r>
+      <w:proofErr w:type="spellEnd"/>
     </w:p>
     <w:p>
       <w:pPr>
@@ -8122,7 +8507,15 @@
         <w:spacing w:after="60"/>
       </w:pPr>
       <w:r>
-        <w:t>Run GPIO self-test into buffers and AND gates with no power stages populated if possible.</w:t>
+        <w:t xml:space="preserve">Run GPIO self-test into buffers and </w:t>
+      </w:r>
+      <w:proofErr w:type="spellStart"/>
+      <w:r>
+        <w:t>AND</w:t>
+      </w:r>
+      <w:proofErr w:type="spellEnd"/>
+      <w:r>
+        <w:t xml:space="preserve"> gates with no power stages populated if possible.</w:t>
       </w:r>
     </w:p>
     <w:p>
@@ -8266,7 +8659,15 @@
         <w:spacing w:after="60"/>
       </w:pPr>
       <w:r>
-        <w:t>Every symbol exists in KiCad and matches the datasheet pinout.</w:t>
+        <w:t xml:space="preserve">Every symbol exists in </w:t>
+      </w:r>
+      <w:proofErr w:type="spellStart"/>
+      <w:r>
+        <w:t>KiCad</w:t>
+      </w:r>
+      <w:proofErr w:type="spellEnd"/>
+      <w:r>
+        <w:t xml:space="preserve"> and matches the datasheet pinout.</w:t>
       </w:r>
     </w:p>
     <w:p>
@@ -8275,7 +8676,15 @@
         <w:spacing w:after="60"/>
       </w:pPr>
       <w:r>
-        <w:t>Every footprint exists in KiCad and matches the manufacturer land pattern.</w:t>
+        <w:t xml:space="preserve">Every footprint exists in </w:t>
+      </w:r>
+      <w:proofErr w:type="spellStart"/>
+      <w:r>
+        <w:t>KiCad</w:t>
+      </w:r>
+      <w:proofErr w:type="spellEnd"/>
+      <w:r>
+        <w:t xml:space="preserve"> and matches the manufacturer land pattern.</w:t>
       </w:r>
     </w:p>
     <w:p>
@@ -8537,7 +8946,15 @@
         <w:spacing w:after="60"/>
       </w:pPr>
       <w:r>
-        <w:t>Firmware implements high_power disable command.</w:t>
+        <w:t xml:space="preserve">Firmware implements </w:t>
+      </w:r>
+      <w:proofErr w:type="spellStart"/>
+      <w:r>
+        <w:t>high_power</w:t>
+      </w:r>
+      <w:proofErr w:type="spellEnd"/>
+      <w:r>
+        <w:t xml:space="preserve"> disable command.</w:t>
       </w:r>
     </w:p>
     <w:p>
@@ -8760,7 +9177,15 @@
           </w:tcPr>
           <w:p>
             <w:r>
-              <w:t>Compare final controller sheet against Raspberry Pi official minimal design and the Bronco Space Lab BLVLink hardware v2.0 reference design before PCB routing.</w:t>
+              <w:t xml:space="preserve">Compare final controller sheet against Raspberry Pi official minimal design and the Bronco Space Lab </w:t>
+            </w:r>
+            <w:proofErr w:type="spellStart"/>
+            <w:r>
+              <w:t>BLVLink</w:t>
+            </w:r>
+            <w:proofErr w:type="spellEnd"/>
+            <w:r>
+              <w:t xml:space="preserve"> hardware v2.0 reference design before PCB routing.</w:t>
             </w:r>
           </w:p>
         </w:tc>
@@ -8937,7 +9362,23 @@
                   <w:color w:val="0563C1"/>
                   <w:u w:val="single"/>
                 </w:rPr>
-                <w:t>Bronco Space Lab BLVLink hardware v2.0 GitHub repository</w:t>
+                <w:t xml:space="preserve">Bronco Space Lab </w:t>
+              </w:r>
+              <w:proofErr w:type="spellStart"/>
+              <w:r>
+                <w:rPr>
+                  <w:color w:val="0563C1"/>
+                  <w:u w:val="single"/>
+                </w:rPr>
+                <w:t>BLVLink</w:t>
+              </w:r>
+              <w:proofErr w:type="spellEnd"/>
+              <w:r>
+                <w:rPr>
+                  <w:color w:val="0563C1"/>
+                  <w:u w:val="single"/>
+                </w:rPr>
+                <w:t xml:space="preserve"> hardware v2.0 GitHub repository</w:t>
               </w:r>
             </w:hyperlink>
           </w:p>
@@ -8948,7 +9389,15 @@
           </w:tcPr>
           <w:p>
             <w:r>
-              <w:t>RP2350 reference design cross-check. Use this repository to compare the custom controller sheet against known RP2350 support circuitry, including MCU schematic structure, USB, flash, crystal, SWD, BOOTSEL/RUN, and KiCad project organization before PCB routing.</w:t>
+              <w:t xml:space="preserve">RP2350 reference design cross-check. Use this repository to compare the custom controller sheet against known RP2350 support circuitry, including MCU schematic structure, USB, flash, crystal, SWD, BOOTSEL/RUN, and </w:t>
+            </w:r>
+            <w:proofErr w:type="spellStart"/>
+            <w:r>
+              <w:t>KiCad</w:t>
+            </w:r>
+            <w:proofErr w:type="spellEnd"/>
+            <w:r>
+              <w:t xml:space="preserve"> project organization before PCB routing.</w:t>
             </w:r>
           </w:p>
         </w:tc>
@@ -9041,7 +9490,21 @@
               <w:rPr>
                 <w:sz w:val="16"/>
               </w:rPr>
-              <w:t>MOSFET voltage, package, RDS(on), current class, gate charge.</w:t>
+              <w:t xml:space="preserve">MOSFET voltage, package, </w:t>
+            </w:r>
+            <w:proofErr w:type="gramStart"/>
+            <w:r>
+              <w:rPr>
+                <w:sz w:val="16"/>
+              </w:rPr>
+              <w:t>RDS(</w:t>
+            </w:r>
+            <w:proofErr w:type="gramEnd"/>
+            <w:r>
+              <w:rPr>
+                <w:sz w:val="16"/>
+              </w:rPr>
+              <w:t>on), current class, gate charge.</w:t>
             </w:r>
           </w:p>
         </w:tc>
@@ -9134,7 +9597,21 @@
               <w:rPr>
                 <w:sz w:val="16"/>
               </w:rPr>
-              <w:t>I2C buffer, bus recovery, hot-swap/buffering behavior.</w:t>
+              <w:t xml:space="preserve">I2C buffer, bus recovery, </w:t>
+            </w:r>
+            <w:proofErr w:type="gramStart"/>
+            <w:r>
+              <w:rPr>
+                <w:sz w:val="16"/>
+              </w:rPr>
+              <w:t>hot-swap</w:t>
+            </w:r>
+            <w:proofErr w:type="gramEnd"/>
+            <w:r>
+              <w:rPr>
+                <w:sz w:val="16"/>
+              </w:rPr>
+              <w:t>/buffering behavior.</w:t>
             </w:r>
           </w:p>
         </w:tc>
@@ -9179,8 +9656,13 @@
             <w:tcW w:w="5256" w:type="dxa"/>
           </w:tcPr>
           <w:p>
-            <w:r>
-              <w:t>Abracon ABM8-272-T3 listing</w:t>
+            <w:proofErr w:type="spellStart"/>
+            <w:r>
+              <w:t>Abracon</w:t>
+            </w:r>
+            <w:proofErr w:type="spellEnd"/>
+            <w:r>
+              <w:t xml:space="preserve"> ABM8-272-T3 listing</w:t>
             </w:r>
           </w:p>
         </w:tc>

</xml_diff>

<commit_message>
Lots of Goodies. Getting the ball rolling
Merged Jasons changed on starting the RP2350.
I refactored his symbols, fixed some connections, and started implementing the buffers as well as all the necessary GPIO connections.
</commit_message>
<xml_diff>
--- a/BILLEE_Rover_Control_Module_V1/PDB_Engineering_Requirements_and_Design_Guide_Rev_G.docx
+++ b/BILLEE_Rover_Control_Module_V1/PDB_Engineering_Requirements_and_Design_Guide_Rev_G.docx
@@ -3414,13 +3414,7 @@
         <w:spacing w:after="60"/>
       </w:pPr>
       <w:r>
-        <w:t xml:space="preserve">       </w:t>
-      </w:r>
-      <w:r>
-        <w:t xml:space="preserve">|-- INA780x </w:t>
-      </w:r>
-      <w:r>
-        <w:t>LOGIC</w:t>
+        <w:t xml:space="preserve">       |-- INA780x LOGIC</w:t>
       </w:r>
       <w:r>
         <w:br/>
@@ -4191,11 +4185,22 @@
             <w:tcW w:w="3024" w:type="dxa"/>
           </w:tcPr>
           <w:p>
+            <w:pPr>
+              <w:tabs>
+                <w:tab w:val="right" w:pos="2808"/>
+              </w:tabs>
+            </w:pPr>
             <w:r>
               <w:rPr>
                 <w:sz w:val="16"/>
               </w:rPr>
               <w:t>MCP9808 DRIVE_TEMP</w:t>
+            </w:r>
+            <w:r>
+              <w:rPr>
+                <w:sz w:val="16"/>
+              </w:rPr>
+              <w:tab/>
             </w:r>
           </w:p>
         </w:tc>

</xml_diff>

<commit_message>
Updated for schematic review by claude
</commit_message>
<xml_diff>
--- a/BILLEE_Rover_Control_Module_V1/PDB_Engineering_Requirements_and_Design_Guide_Rev_G.docx
+++ b/BILLEE_Rover_Control_Module_V1/PDB_Engineering_Requirements_and_Design_Guide_Rev_G.docx
@@ -129,7 +129,21 @@
               <w:rPr>
                 <w:sz w:val="16"/>
               </w:rPr>
-              <w:t>Replaced onboard RP2040/Pico concept with bare RP2350A baseline controller. Updated GPIO allocation, I2C topology, Zephyr bindings, KiCad sheet plan, and LCSC part list. Kept six drivetrain MOSFET branches and split ARM/SCIENCE rails. Removed MCP23017 from baseline.</w:t>
+              <w:t xml:space="preserve">Replaced onboard RP2040/Pico concept with bare RP2350A baseline controller. Updated GPIO allocation, I2C topology, Zephyr bindings, </w:t>
+            </w:r>
+            <w:proofErr w:type="spellStart"/>
+            <w:r>
+              <w:rPr>
+                <w:sz w:val="16"/>
+              </w:rPr>
+              <w:t>KiCad</w:t>
+            </w:r>
+            <w:proofErr w:type="spellEnd"/>
+            <w:r>
+              <w:rPr>
+                <w:sz w:val="16"/>
+              </w:rPr>
+              <w:t xml:space="preserve"> sheet plan, and LCSC part list. Kept six drivetrain MOSFET branches and split ARM/SCIENCE rails. Removed MCP23017 from baseline.</w:t>
             </w:r>
           </w:p>
         </w:tc>
@@ -218,7 +232,15 @@
         <w:spacing w:after="60"/>
       </w:pPr>
       <w:r>
-        <w:t>8. KiCad Schematic Sheet Plan</w:t>
+        <w:t xml:space="preserve">8. </w:t>
+      </w:r>
+      <w:proofErr w:type="spellStart"/>
+      <w:r>
+        <w:t>KiCad</w:t>
+      </w:r>
+      <w:proofErr w:type="spellEnd"/>
+      <w:r>
+        <w:t xml:space="preserve"> Schematic Sheet Plan</w:t>
       </w:r>
     </w:p>
     <w:p>
@@ -281,7 +303,15 @@
         <w:spacing w:after="60"/>
       </w:pPr>
       <w:r>
-        <w:t>Use Sections 2 and 3 to teach the architecture before opening KiCad.</w:t>
+        <w:t xml:space="preserve">Use Sections 2 and 3 to teach the architecture before opening </w:t>
+      </w:r>
+      <w:proofErr w:type="spellStart"/>
+      <w:r>
+        <w:t>KiCad</w:t>
+      </w:r>
+      <w:proofErr w:type="spellEnd"/>
+      <w:r>
+        <w:t>.</w:t>
       </w:r>
     </w:p>
     <w:p>
@@ -389,7 +419,15 @@
         <w:spacing w:after="60"/>
       </w:pPr>
       <w:r>
-        <w:t>The schematic shall follow the Raspberry Pi RP2350 hardware design guide and the Bronco Space Lab BLVLink hardware v2.0 reference design for RP2350 support circuitry.</w:t>
+        <w:t xml:space="preserve">The schematic shall follow the Raspberry Pi RP2350 hardware design guide and the Bronco Space Lab </w:t>
+      </w:r>
+      <w:proofErr w:type="spellStart"/>
+      <w:r>
+        <w:t>BLVLink</w:t>
+      </w:r>
+      <w:proofErr w:type="spellEnd"/>
+      <w:r>
+        <w:t xml:space="preserve"> hardware v2.0 reference design for RP2350 support circuitry.</w:t>
       </w:r>
     </w:p>
     <w:p>
@@ -799,7 +837,15 @@
         <w:spacing w:after="60"/>
       </w:pPr>
       <w:r>
-        <w:t>Each drivetrain branch shall have one dedicated native RP2350 DRIVE_EN_x GPIO.</w:t>
+        <w:t xml:space="preserve">Each drivetrain branch shall have one dedicated native RP2350 </w:t>
+      </w:r>
+      <w:proofErr w:type="spellStart"/>
+      <w:r>
+        <w:t>DRIVE_EN_x</w:t>
+      </w:r>
+      <w:proofErr w:type="spellEnd"/>
+      <w:r>
+        <w:t xml:space="preserve"> GPIO.</w:t>
       </w:r>
     </w:p>
     <w:p>
@@ -808,7 +854,15 @@
         <w:spacing w:after="60"/>
       </w:pPr>
       <w:r>
-        <w:t>Each DRIVE_EN_x signal shall pass through the GPIO buffer and E-stop gate before reaching the gate-driver input.</w:t>
+        <w:t xml:space="preserve">Each </w:t>
+      </w:r>
+      <w:proofErr w:type="spellStart"/>
+      <w:r>
+        <w:t>DRIVE_EN_x</w:t>
+      </w:r>
+      <w:proofErr w:type="spellEnd"/>
+      <w:r>
+        <w:t xml:space="preserve"> signal shall pass through the GPIO buffer and E-stop gate before reaching the gate-driver input.</w:t>
       </w:r>
     </w:p>
     <w:p>
@@ -1024,7 +1078,15 @@
         <w:spacing w:after="60"/>
       </w:pPr>
       <w:r>
-        <w:t>The GPIO buffer and AND gates shall be powered from the 3.3 V housekeeping rail.</w:t>
+        <w:t xml:space="preserve">The GPIO buffer and </w:t>
+      </w:r>
+      <w:proofErr w:type="spellStart"/>
+      <w:r>
+        <w:t>AND</w:t>
+      </w:r>
+      <w:proofErr w:type="spellEnd"/>
+      <w:r>
+        <w:t xml:space="preserve"> gates shall be powered from the 3.3 V housekeeping rail.</w:t>
       </w:r>
     </w:p>
     <w:p>
@@ -1261,8 +1323,13 @@
       </w:r>
       <w:r>
         <w:br/>
-        <w:t>RP2350 DRIVE_EN_x</w:t>
-      </w:r>
+        <w:t xml:space="preserve">RP2350 </w:t>
+      </w:r>
+      <w:proofErr w:type="spellStart"/>
+      <w:r>
+        <w:t>DRIVE_EN_x</w:t>
+      </w:r>
+      <w:proofErr w:type="spellEnd"/>
       <w:r>
         <w:br/>
         <w:t xml:space="preserve">   |</w:t>
@@ -2383,11 +2450,27 @@
             </w:r>
             <w:r>
               <w:br/>
-              <w:t xml:space="preserve">Since this mosfet after about ~8v reaches its </w:t>
+              <w:t xml:space="preserve">Since this </w:t>
+            </w:r>
+            <w:proofErr w:type="spellStart"/>
+            <w:r>
+              <w:t>mosfet</w:t>
+            </w:r>
+            <w:proofErr w:type="spellEnd"/>
+            <w:r>
+              <w:t xml:space="preserve"> after about ~8v reaches its </w:t>
             </w:r>
             <w:r>
               <w:lastRenderedPageBreak/>
-              <w:t>“peak” current capabilities, you can set the vcc of this to be on the 12v rail output</w:t>
+              <w:t xml:space="preserve">“peak” current capabilities, you can set the </w:t>
+            </w:r>
+            <w:proofErr w:type="spellStart"/>
+            <w:r>
+              <w:t>vcc</w:t>
+            </w:r>
+            <w:proofErr w:type="spellEnd"/>
+            <w:r>
+              <w:t xml:space="preserve"> of this to be on the 12v rail output</w:t>
             </w:r>
           </w:p>
         </w:tc>
@@ -2891,7 +2974,15 @@
               <w:br/>
             </w:r>
             <w:r>
-              <w:t>Jetson power + networkswitch + POE will use screw terminal blocks</w:t>
+              <w:t xml:space="preserve">Jetson power + </w:t>
+            </w:r>
+            <w:proofErr w:type="spellStart"/>
+            <w:r>
+              <w:t>networkswitch</w:t>
+            </w:r>
+            <w:proofErr w:type="spellEnd"/>
+            <w:r>
+              <w:t xml:space="preserve"> + POE will use screw terminal blocks</w:t>
             </w:r>
           </w:p>
         </w:tc>
@@ -2934,13 +3025,7 @@
               <w:rPr>
                 <w:sz w:val="16"/>
               </w:rPr>
-              <w:t>XT60</w:t>
-            </w:r>
-            <w:r>
-              <w:rPr>
-                <w:sz w:val="16"/>
-              </w:rPr>
-              <w:t>M</w:t>
+              <w:t>XT60M</w:t>
             </w:r>
           </w:p>
         </w:tc>
@@ -3021,13 +3106,7 @@
               <w:rPr>
                 <w:sz w:val="16"/>
               </w:rPr>
-              <w:t xml:space="preserve"> battery inputs</w:t>
-            </w:r>
-            <w:r>
-              <w:rPr>
-                <w:sz w:val="16"/>
-              </w:rPr>
-              <w:t>,</w:t>
+              <w:t xml:space="preserve"> battery inputs,</w:t>
             </w:r>
             <w:r>
               <w:rPr>
@@ -3103,13 +3182,7 @@
               <w:rPr>
                 <w:sz w:val="16"/>
               </w:rPr>
-              <w:t>9</w:t>
-            </w:r>
-            <w:r>
-              <w:rPr>
-                <w:sz w:val="16"/>
-              </w:rPr>
-              <w:t xml:space="preserve"> typical</w:t>
+              <w:t>9 typical</w:t>
             </w:r>
           </w:p>
         </w:tc>
@@ -3122,13 +3195,7 @@
               <w:rPr>
                 <w:sz w:val="16"/>
               </w:rPr>
-              <w:t>S</w:t>
-            </w:r>
-            <w:r>
-              <w:rPr>
-                <w:sz w:val="16"/>
-              </w:rPr>
-              <w:t>ix drivetrain outputs, ARM output</w:t>
+              <w:t>Six drivetrain outputs, ARM output</w:t>
             </w:r>
             <w:r>
               <w:rPr>
@@ -4686,9 +4753,9 @@
         <w:tblLook w:val="04A0" w:firstRow="1" w:lastRow="0" w:firstColumn="1" w:lastColumn="0" w:noHBand="0" w:noVBand="1"/>
       </w:tblPr>
       <w:tblGrid>
-        <w:gridCol w:w="1290"/>
-        <w:gridCol w:w="2871"/>
-        <w:gridCol w:w="6567"/>
+        <w:gridCol w:w="1291"/>
+        <w:gridCol w:w="2865"/>
+        <w:gridCol w:w="6572"/>
       </w:tblGrid>
       <w:tr>
         <w:trPr>
@@ -4697,7 +4764,7 @@
         </w:trPr>
         <w:tc>
           <w:tcPr>
-            <w:tcW w:w="1296" w:type="dxa"/>
+            <w:tcW w:w="1291" w:type="dxa"/>
             <w:shd w:val="clear" w:color="auto" w:fill="D9EAF7"/>
             <w:vAlign w:val="center"/>
           </w:tcPr>
@@ -4713,7 +4780,7 @@
         </w:tc>
         <w:tc>
           <w:tcPr>
-            <w:tcW w:w="2880" w:type="dxa"/>
+            <w:tcW w:w="2865" w:type="dxa"/>
             <w:shd w:val="clear" w:color="auto" w:fill="D9EAF7"/>
             <w:vAlign w:val="center"/>
           </w:tcPr>
@@ -4729,7 +4796,7 @@
         </w:tc>
         <w:tc>
           <w:tcPr>
-            <w:tcW w:w="6624" w:type="dxa"/>
+            <w:tcW w:w="6572" w:type="dxa"/>
             <w:shd w:val="clear" w:color="auto" w:fill="D9EAF7"/>
             <w:vAlign w:val="center"/>
           </w:tcPr>
@@ -4750,7 +4817,7 @@
         </w:trPr>
         <w:tc>
           <w:tcPr>
-            <w:tcW w:w="1296" w:type="dxa"/>
+            <w:tcW w:w="1291" w:type="dxa"/>
           </w:tcPr>
           <w:p>
             <w:r>
@@ -4763,7 +4830,7 @@
         </w:tc>
         <w:tc>
           <w:tcPr>
-            <w:tcW w:w="2880" w:type="dxa"/>
+            <w:tcW w:w="2865" w:type="dxa"/>
           </w:tcPr>
           <w:p>
             <w:r>
@@ -4776,7 +4843,7 @@
         </w:tc>
         <w:tc>
           <w:tcPr>
-            <w:tcW w:w="6624" w:type="dxa"/>
+            <w:tcW w:w="6572" w:type="dxa"/>
           </w:tcPr>
           <w:p>
             <w:r>
@@ -4794,7 +4861,7 @@
         </w:trPr>
         <w:tc>
           <w:tcPr>
-            <w:tcW w:w="1296" w:type="dxa"/>
+            <w:tcW w:w="1291" w:type="dxa"/>
           </w:tcPr>
           <w:p>
             <w:r>
@@ -4807,7 +4874,7 @@
         </w:tc>
         <w:tc>
           <w:tcPr>
-            <w:tcW w:w="2880" w:type="dxa"/>
+            <w:tcW w:w="2865" w:type="dxa"/>
           </w:tcPr>
           <w:p>
             <w:r>
@@ -4820,7 +4887,7 @@
         </w:tc>
         <w:tc>
           <w:tcPr>
-            <w:tcW w:w="6624" w:type="dxa"/>
+            <w:tcW w:w="6572" w:type="dxa"/>
           </w:tcPr>
           <w:p>
             <w:r>
@@ -4838,7 +4905,7 @@
         </w:trPr>
         <w:tc>
           <w:tcPr>
-            <w:tcW w:w="1296" w:type="dxa"/>
+            <w:tcW w:w="1291" w:type="dxa"/>
           </w:tcPr>
           <w:p>
             <w:r>
@@ -4851,7 +4918,7 @@
         </w:tc>
         <w:tc>
           <w:tcPr>
-            <w:tcW w:w="2880" w:type="dxa"/>
+            <w:tcW w:w="2865" w:type="dxa"/>
           </w:tcPr>
           <w:p>
             <w:r>
@@ -4864,7 +4931,7 @@
         </w:tc>
         <w:tc>
           <w:tcPr>
-            <w:tcW w:w="6624" w:type="dxa"/>
+            <w:tcW w:w="6572" w:type="dxa"/>
           </w:tcPr>
           <w:p>
             <w:r>
@@ -4882,7 +4949,7 @@
         </w:trPr>
         <w:tc>
           <w:tcPr>
-            <w:tcW w:w="1296" w:type="dxa"/>
+            <w:tcW w:w="1291" w:type="dxa"/>
           </w:tcPr>
           <w:p>
             <w:r>
@@ -4895,7 +4962,7 @@
         </w:tc>
         <w:tc>
           <w:tcPr>
-            <w:tcW w:w="2880" w:type="dxa"/>
+            <w:tcW w:w="2865" w:type="dxa"/>
           </w:tcPr>
           <w:p>
             <w:r>
@@ -4908,7 +4975,7 @@
         </w:tc>
         <w:tc>
           <w:tcPr>
-            <w:tcW w:w="6624" w:type="dxa"/>
+            <w:tcW w:w="6572" w:type="dxa"/>
           </w:tcPr>
           <w:p>
             <w:r>
@@ -4926,7 +4993,7 @@
         </w:trPr>
         <w:tc>
           <w:tcPr>
-            <w:tcW w:w="1296" w:type="dxa"/>
+            <w:tcW w:w="1291" w:type="dxa"/>
           </w:tcPr>
           <w:p>
             <w:r>
@@ -4939,7 +5006,7 @@
         </w:tc>
         <w:tc>
           <w:tcPr>
-            <w:tcW w:w="2880" w:type="dxa"/>
+            <w:tcW w:w="2865" w:type="dxa"/>
           </w:tcPr>
           <w:p>
             <w:r>
@@ -4952,7 +5019,7 @@
         </w:tc>
         <w:tc>
           <w:tcPr>
-            <w:tcW w:w="6624" w:type="dxa"/>
+            <w:tcW w:w="6572" w:type="dxa"/>
           </w:tcPr>
           <w:p>
             <w:r>
@@ -4970,7 +5037,7 @@
         </w:trPr>
         <w:tc>
           <w:tcPr>
-            <w:tcW w:w="1296" w:type="dxa"/>
+            <w:tcW w:w="1291" w:type="dxa"/>
           </w:tcPr>
           <w:p>
             <w:r>
@@ -4983,7 +5050,7 @@
         </w:tc>
         <w:tc>
           <w:tcPr>
-            <w:tcW w:w="2880" w:type="dxa"/>
+            <w:tcW w:w="2865" w:type="dxa"/>
           </w:tcPr>
           <w:p>
             <w:r>
@@ -4996,7 +5063,7 @@
         </w:tc>
         <w:tc>
           <w:tcPr>
-            <w:tcW w:w="6624" w:type="dxa"/>
+            <w:tcW w:w="6572" w:type="dxa"/>
           </w:tcPr>
           <w:p>
             <w:r>
@@ -5014,7 +5081,7 @@
         </w:trPr>
         <w:tc>
           <w:tcPr>
-            <w:tcW w:w="1296" w:type="dxa"/>
+            <w:tcW w:w="1291" w:type="dxa"/>
           </w:tcPr>
           <w:p>
             <w:r>
@@ -5027,7 +5094,7 @@
         </w:tc>
         <w:tc>
           <w:tcPr>
-            <w:tcW w:w="2880" w:type="dxa"/>
+            <w:tcW w:w="2865" w:type="dxa"/>
           </w:tcPr>
           <w:p>
             <w:r>
@@ -5040,7 +5107,7 @@
         </w:tc>
         <w:tc>
           <w:tcPr>
-            <w:tcW w:w="6624" w:type="dxa"/>
+            <w:tcW w:w="6572" w:type="dxa"/>
           </w:tcPr>
           <w:p>
             <w:r>
@@ -5058,7 +5125,7 @@
         </w:trPr>
         <w:tc>
           <w:tcPr>
-            <w:tcW w:w="1296" w:type="dxa"/>
+            <w:tcW w:w="1291" w:type="dxa"/>
           </w:tcPr>
           <w:p>
             <w:r>
@@ -5071,7 +5138,7 @@
         </w:tc>
         <w:tc>
           <w:tcPr>
-            <w:tcW w:w="2880" w:type="dxa"/>
+            <w:tcW w:w="2865" w:type="dxa"/>
           </w:tcPr>
           <w:p>
             <w:r>
@@ -5084,7 +5151,7 @@
         </w:tc>
         <w:tc>
           <w:tcPr>
-            <w:tcW w:w="6624" w:type="dxa"/>
+            <w:tcW w:w="6572" w:type="dxa"/>
           </w:tcPr>
           <w:p>
             <w:r>
@@ -5102,7 +5169,7 @@
         </w:trPr>
         <w:tc>
           <w:tcPr>
-            <w:tcW w:w="1296" w:type="dxa"/>
+            <w:tcW w:w="1291" w:type="dxa"/>
           </w:tcPr>
           <w:p>
             <w:r>
@@ -5115,7 +5182,7 @@
         </w:tc>
         <w:tc>
           <w:tcPr>
-            <w:tcW w:w="2880" w:type="dxa"/>
+            <w:tcW w:w="2865" w:type="dxa"/>
           </w:tcPr>
           <w:p>
             <w:r>
@@ -5128,7 +5195,7 @@
         </w:tc>
         <w:tc>
           <w:tcPr>
-            <w:tcW w:w="6624" w:type="dxa"/>
+            <w:tcW w:w="6572" w:type="dxa"/>
           </w:tcPr>
           <w:p>
             <w:r>
@@ -5146,7 +5213,7 @@
         </w:trPr>
         <w:tc>
           <w:tcPr>
-            <w:tcW w:w="1296" w:type="dxa"/>
+            <w:tcW w:w="1291" w:type="dxa"/>
           </w:tcPr>
           <w:p>
             <w:r>
@@ -5159,7 +5226,7 @@
         </w:tc>
         <w:tc>
           <w:tcPr>
-            <w:tcW w:w="2880" w:type="dxa"/>
+            <w:tcW w:w="2865" w:type="dxa"/>
           </w:tcPr>
           <w:p>
             <w:r>
@@ -5172,7 +5239,7 @@
         </w:tc>
         <w:tc>
           <w:tcPr>
-            <w:tcW w:w="6624" w:type="dxa"/>
+            <w:tcW w:w="6572" w:type="dxa"/>
           </w:tcPr>
           <w:p>
             <w:r>
@@ -5190,7 +5257,7 @@
         </w:trPr>
         <w:tc>
           <w:tcPr>
-            <w:tcW w:w="1296" w:type="dxa"/>
+            <w:tcW w:w="1291" w:type="dxa"/>
           </w:tcPr>
           <w:p>
             <w:r>
@@ -5203,7 +5270,7 @@
         </w:tc>
         <w:tc>
           <w:tcPr>
-            <w:tcW w:w="2880" w:type="dxa"/>
+            <w:tcW w:w="2865" w:type="dxa"/>
           </w:tcPr>
           <w:p>
             <w:r>
@@ -5216,7 +5283,7 @@
         </w:tc>
         <w:tc>
           <w:tcPr>
-            <w:tcW w:w="6624" w:type="dxa"/>
+            <w:tcW w:w="6572" w:type="dxa"/>
           </w:tcPr>
           <w:p>
             <w:r>
@@ -5234,7 +5301,7 @@
         </w:trPr>
         <w:tc>
           <w:tcPr>
-            <w:tcW w:w="1296" w:type="dxa"/>
+            <w:tcW w:w="1291" w:type="dxa"/>
           </w:tcPr>
           <w:p>
             <w:r>
@@ -5247,7 +5314,7 @@
         </w:tc>
         <w:tc>
           <w:tcPr>
-            <w:tcW w:w="2880" w:type="dxa"/>
+            <w:tcW w:w="2865" w:type="dxa"/>
           </w:tcPr>
           <w:p>
             <w:r>
@@ -5260,7 +5327,7 @@
         </w:tc>
         <w:tc>
           <w:tcPr>
-            <w:tcW w:w="6624" w:type="dxa"/>
+            <w:tcW w:w="6572" w:type="dxa"/>
           </w:tcPr>
           <w:p>
             <w:r>
@@ -5278,7 +5345,7 @@
         </w:trPr>
         <w:tc>
           <w:tcPr>
-            <w:tcW w:w="1296" w:type="dxa"/>
+            <w:tcW w:w="1291" w:type="dxa"/>
           </w:tcPr>
           <w:p>
             <w:r>
@@ -5286,33 +5353,30 @@
                 <w:sz w:val="16"/>
               </w:rPr>
               <w:lastRenderedPageBreak/>
-              <w:t>GPIO12</w:t>
-            </w:r>
-          </w:p>
-        </w:tc>
-        <w:tc>
-          <w:tcPr>
-            <w:tcW w:w="2880" w:type="dxa"/>
-          </w:tcPr>
-          <w:p>
-            <w:r>
-              <w:rPr>
-                <w:sz w:val="16"/>
-              </w:rPr>
-              <w:t>AUX_22_EN</w:t>
-            </w:r>
-          </w:p>
-        </w:tc>
-        <w:tc>
-          <w:tcPr>
-            <w:tcW w:w="6624" w:type="dxa"/>
-          </w:tcPr>
-          <w:p>
-            <w:r>
-              <w:rPr>
-                <w:sz w:val="16"/>
-              </w:rPr>
-              <w:t>Native output -&gt; buffer -&gt; E-stop gate -&gt; aux switch/driver</w:t>
+              <w:t>GPIO13</w:t>
+            </w:r>
+          </w:p>
+        </w:tc>
+        <w:tc>
+          <w:tcPr>
+            <w:tcW w:w="2865" w:type="dxa"/>
+          </w:tcPr>
+          <w:p>
+            <w:r>
+              <w:rPr>
+                <w:sz w:val="16"/>
+              </w:rPr>
+              <w:t>E_STOP_STATUS</w:t>
+            </w:r>
+          </w:p>
+        </w:tc>
+        <w:tc>
+          <w:tcPr>
+            <w:tcW w:w="6572" w:type="dxa"/>
+          </w:tcPr>
+          <w:p>
+            <w:r>
+              <w:t>ESTOP GPIO Monitor</w:t>
             </w:r>
           </w:p>
         </w:tc>
@@ -5323,48 +5387,32 @@
         </w:trPr>
         <w:tc>
           <w:tcPr>
-            <w:tcW w:w="1296" w:type="dxa"/>
-          </w:tcPr>
-          <w:p>
-            <w:r>
-              <w:rPr>
-                <w:sz w:val="16"/>
-              </w:rPr>
-              <w:t>GPIO13</w:t>
-            </w:r>
-          </w:p>
-        </w:tc>
-        <w:tc>
-          <w:tcPr>
-            <w:tcW w:w="2880" w:type="dxa"/>
-          </w:tcPr>
-          <w:p>
-            <w:r>
-              <w:rPr>
-                <w:sz w:val="16"/>
-              </w:rPr>
-              <w:t>SPARE_EN</w:t>
-            </w:r>
-            <w:r>
-              <w:rPr>
-                <w:sz w:val="16"/>
-              </w:rPr>
-              <w:t xml:space="preserve"> (NOT NEEDED)</w:t>
-            </w:r>
-          </w:p>
-        </w:tc>
-        <w:tc>
-          <w:tcPr>
-            <w:tcW w:w="6624" w:type="dxa"/>
-          </w:tcPr>
-          <w:p>
-            <w:r>
-              <w:rPr>
-                <w:sz w:val="16"/>
-              </w:rPr>
-              <w:t>Buffered spare output; route to test pad or spare gate channel</w:t>
-            </w:r>
-          </w:p>
+            <w:tcW w:w="1291" w:type="dxa"/>
+          </w:tcPr>
+          <w:p>
+            <w:r>
+              <w:rPr>
+                <w:sz w:val="16"/>
+              </w:rPr>
+              <w:t>GPIO14</w:t>
+            </w:r>
+          </w:p>
+        </w:tc>
+        <w:tc>
+          <w:tcPr>
+            <w:tcW w:w="2865" w:type="dxa"/>
+          </w:tcPr>
+          <w:p>
+            <w:r>
+              <w:t>Broken out on DF11 Header</w:t>
+            </w:r>
+          </w:p>
+        </w:tc>
+        <w:tc>
+          <w:tcPr>
+            <w:tcW w:w="6572" w:type="dxa"/>
+          </w:tcPr>
+          <w:p/>
         </w:tc>
       </w:tr>
       <w:tr>
@@ -5373,42 +5421,32 @@
         </w:trPr>
         <w:tc>
           <w:tcPr>
-            <w:tcW w:w="1296" w:type="dxa"/>
-          </w:tcPr>
-          <w:p>
-            <w:r>
-              <w:rPr>
-                <w:sz w:val="16"/>
-              </w:rPr>
-              <w:t>GPIO14</w:t>
-            </w:r>
-          </w:p>
-        </w:tc>
-        <w:tc>
-          <w:tcPr>
-            <w:tcW w:w="2880" w:type="dxa"/>
-          </w:tcPr>
-          <w:p>
-            <w:r>
-              <w:rPr>
-                <w:sz w:val="16"/>
-              </w:rPr>
-              <w:t>E_STOP_STATUS</w:t>
-            </w:r>
-          </w:p>
-        </w:tc>
-        <w:tc>
-          <w:tcPr>
-            <w:tcW w:w="6624" w:type="dxa"/>
-          </w:tcPr>
-          <w:p>
-            <w:r>
-              <w:rPr>
-                <w:sz w:val="16"/>
-              </w:rPr>
-              <w:t>Input from E_STOP_NODE / E_STOP_OK conditioning</w:t>
-            </w:r>
-          </w:p>
+            <w:tcW w:w="1291" w:type="dxa"/>
+          </w:tcPr>
+          <w:p>
+            <w:r>
+              <w:rPr>
+                <w:sz w:val="16"/>
+              </w:rPr>
+              <w:t>GPIO15</w:t>
+            </w:r>
+          </w:p>
+        </w:tc>
+        <w:tc>
+          <w:tcPr>
+            <w:tcW w:w="2865" w:type="dxa"/>
+          </w:tcPr>
+          <w:p>
+            <w:r>
+              <w:t>Broken out on DF11 Header</w:t>
+            </w:r>
+          </w:p>
+        </w:tc>
+        <w:tc>
+          <w:tcPr>
+            <w:tcW w:w="6572" w:type="dxa"/>
+          </w:tcPr>
+          <w:p/>
         </w:tc>
       </w:tr>
       <w:tr>
@@ -5417,42 +5455,32 @@
         </w:trPr>
         <w:tc>
           <w:tcPr>
-            <w:tcW w:w="1296" w:type="dxa"/>
-          </w:tcPr>
-          <w:p>
-            <w:r>
-              <w:rPr>
-                <w:sz w:val="16"/>
-              </w:rPr>
-              <w:t>GPIO15</w:t>
-            </w:r>
-          </w:p>
-        </w:tc>
-        <w:tc>
-          <w:tcPr>
-            <w:tcW w:w="2880" w:type="dxa"/>
-          </w:tcPr>
-          <w:p>
-            <w:r>
-              <w:rPr>
-                <w:sz w:val="16"/>
-              </w:rPr>
-              <w:t>PDB_FAULT_OUT</w:t>
-            </w:r>
-          </w:p>
-        </w:tc>
-        <w:tc>
-          <w:tcPr>
-            <w:tcW w:w="6624" w:type="dxa"/>
-          </w:tcPr>
-          <w:p>
-            <w:r>
-              <w:rPr>
-                <w:sz w:val="16"/>
-              </w:rPr>
-              <w:t>Output to Jetson or external fault indicator</w:t>
-            </w:r>
-          </w:p>
+            <w:tcW w:w="1291" w:type="dxa"/>
+          </w:tcPr>
+          <w:p>
+            <w:r>
+              <w:rPr>
+                <w:sz w:val="16"/>
+              </w:rPr>
+              <w:t>GPIO16</w:t>
+            </w:r>
+          </w:p>
+        </w:tc>
+        <w:tc>
+          <w:tcPr>
+            <w:tcW w:w="2865" w:type="dxa"/>
+          </w:tcPr>
+          <w:p>
+            <w:r>
+              <w:t>Broken out on DF11 Header</w:t>
+            </w:r>
+          </w:p>
+        </w:tc>
+        <w:tc>
+          <w:tcPr>
+            <w:tcW w:w="6572" w:type="dxa"/>
+          </w:tcPr>
+          <w:p/>
         </w:tc>
       </w:tr>
       <w:tr>
@@ -5461,42 +5489,32 @@
         </w:trPr>
         <w:tc>
           <w:tcPr>
-            <w:tcW w:w="1296" w:type="dxa"/>
-          </w:tcPr>
-          <w:p>
-            <w:r>
-              <w:rPr>
-                <w:sz w:val="16"/>
-              </w:rPr>
-              <w:t>GPIO16</w:t>
-            </w:r>
-          </w:p>
-        </w:tc>
-        <w:tc>
-          <w:tcPr>
-            <w:tcW w:w="2880" w:type="dxa"/>
-          </w:tcPr>
-          <w:p>
-            <w:r>
-              <w:rPr>
-                <w:sz w:val="16"/>
-              </w:rPr>
-              <w:t>JETSON_HEARTBEAT_IN</w:t>
-            </w:r>
-          </w:p>
-        </w:tc>
-        <w:tc>
-          <w:tcPr>
-            <w:tcW w:w="6624" w:type="dxa"/>
-          </w:tcPr>
-          <w:p>
-            <w:r>
-              <w:rPr>
-                <w:sz w:val="16"/>
-              </w:rPr>
-              <w:t>Optional input from Jetson</w:t>
-            </w:r>
-          </w:p>
+            <w:tcW w:w="1291" w:type="dxa"/>
+          </w:tcPr>
+          <w:p>
+            <w:r>
+              <w:rPr>
+                <w:sz w:val="16"/>
+              </w:rPr>
+              <w:t>GPIO17</w:t>
+            </w:r>
+          </w:p>
+        </w:tc>
+        <w:tc>
+          <w:tcPr>
+            <w:tcW w:w="2865" w:type="dxa"/>
+          </w:tcPr>
+          <w:p>
+            <w:r>
+              <w:t>Broken out on DF11 Header</w:t>
+            </w:r>
+          </w:p>
+        </w:tc>
+        <w:tc>
+          <w:tcPr>
+            <w:tcW w:w="6572" w:type="dxa"/>
+          </w:tcPr>
+          <w:p/>
         </w:tc>
       </w:tr>
       <w:tr>
@@ -5505,42 +5523,32 @@
         </w:trPr>
         <w:tc>
           <w:tcPr>
-            <w:tcW w:w="1296" w:type="dxa"/>
-          </w:tcPr>
-          <w:p>
-            <w:r>
-              <w:rPr>
-                <w:sz w:val="16"/>
-              </w:rPr>
-              <w:t>GPIO17</w:t>
-            </w:r>
-          </w:p>
-        </w:tc>
-        <w:tc>
-          <w:tcPr>
-            <w:tcW w:w="2880" w:type="dxa"/>
-          </w:tcPr>
-          <w:p>
-            <w:r>
-              <w:rPr>
-                <w:sz w:val="16"/>
-              </w:rPr>
-              <w:t>TCA4307_I2C0_EN</w:t>
-            </w:r>
-          </w:p>
-        </w:tc>
-        <w:tc>
-          <w:tcPr>
-            <w:tcW w:w="6624" w:type="dxa"/>
-          </w:tcPr>
-          <w:p>
-            <w:r>
-              <w:rPr>
-                <w:sz w:val="16"/>
-              </w:rPr>
-              <w:t>Optional enable/reset for I2C0 buffer</w:t>
-            </w:r>
-          </w:p>
+            <w:tcW w:w="1291" w:type="dxa"/>
+          </w:tcPr>
+          <w:p>
+            <w:r>
+              <w:rPr>
+                <w:sz w:val="16"/>
+              </w:rPr>
+              <w:t>GPIO18</w:t>
+            </w:r>
+          </w:p>
+        </w:tc>
+        <w:tc>
+          <w:tcPr>
+            <w:tcW w:w="2865" w:type="dxa"/>
+          </w:tcPr>
+          <w:p>
+            <w:r>
+              <w:t>Broken out on DF11 Header</w:t>
+            </w:r>
+          </w:p>
+        </w:tc>
+        <w:tc>
+          <w:tcPr>
+            <w:tcW w:w="6572" w:type="dxa"/>
+          </w:tcPr>
+          <w:p/>
         </w:tc>
       </w:tr>
       <w:tr>
@@ -5549,42 +5557,32 @@
         </w:trPr>
         <w:tc>
           <w:tcPr>
-            <w:tcW w:w="1296" w:type="dxa"/>
-          </w:tcPr>
-          <w:p>
-            <w:r>
-              <w:rPr>
-                <w:sz w:val="16"/>
-              </w:rPr>
-              <w:t>GPIO18</w:t>
-            </w:r>
-          </w:p>
-        </w:tc>
-        <w:tc>
-          <w:tcPr>
-            <w:tcW w:w="2880" w:type="dxa"/>
-          </w:tcPr>
-          <w:p>
-            <w:r>
-              <w:rPr>
-                <w:sz w:val="16"/>
-              </w:rPr>
-              <w:t>TCA4307_I2C1_EN</w:t>
-            </w:r>
-          </w:p>
-        </w:tc>
-        <w:tc>
-          <w:tcPr>
-            <w:tcW w:w="6624" w:type="dxa"/>
-          </w:tcPr>
-          <w:p>
-            <w:r>
-              <w:rPr>
-                <w:sz w:val="16"/>
-              </w:rPr>
-              <w:t>Optional enable/reset for I2C1 buffer</w:t>
-            </w:r>
-          </w:p>
+            <w:tcW w:w="1291" w:type="dxa"/>
+          </w:tcPr>
+          <w:p>
+            <w:r>
+              <w:rPr>
+                <w:sz w:val="16"/>
+              </w:rPr>
+              <w:t>GPIO19</w:t>
+            </w:r>
+          </w:p>
+        </w:tc>
+        <w:tc>
+          <w:tcPr>
+            <w:tcW w:w="2865" w:type="dxa"/>
+          </w:tcPr>
+          <w:p>
+            <w:r>
+              <w:t>Broken out on DF11 Header</w:t>
+            </w:r>
+          </w:p>
+        </w:tc>
+        <w:tc>
+          <w:tcPr>
+            <w:tcW w:w="6572" w:type="dxa"/>
+          </w:tcPr>
+          <w:p/>
         </w:tc>
       </w:tr>
       <w:tr>
@@ -5593,42 +5591,32 @@
         </w:trPr>
         <w:tc>
           <w:tcPr>
-            <w:tcW w:w="1296" w:type="dxa"/>
-          </w:tcPr>
-          <w:p>
-            <w:r>
-              <w:rPr>
-                <w:sz w:val="16"/>
-              </w:rPr>
-              <w:t>GPIO19</w:t>
-            </w:r>
-          </w:p>
-        </w:tc>
-        <w:tc>
-          <w:tcPr>
-            <w:tcW w:w="2880" w:type="dxa"/>
-          </w:tcPr>
-          <w:p>
-            <w:r>
-              <w:rPr>
-                <w:sz w:val="16"/>
-              </w:rPr>
-              <w:t>STATUS_LED</w:t>
-            </w:r>
-          </w:p>
-        </w:tc>
-        <w:tc>
-          <w:tcPr>
-            <w:tcW w:w="6624" w:type="dxa"/>
-          </w:tcPr>
-          <w:p>
-            <w:r>
-              <w:rPr>
-                <w:sz w:val="16"/>
-              </w:rPr>
-              <w:t>Controller heartbeat LED</w:t>
-            </w:r>
-          </w:p>
+            <w:tcW w:w="1291" w:type="dxa"/>
+          </w:tcPr>
+          <w:p>
+            <w:r>
+              <w:rPr>
+                <w:sz w:val="16"/>
+              </w:rPr>
+              <w:t>GPIO20</w:t>
+            </w:r>
+          </w:p>
+        </w:tc>
+        <w:tc>
+          <w:tcPr>
+            <w:tcW w:w="2865" w:type="dxa"/>
+          </w:tcPr>
+          <w:p>
+            <w:r>
+              <w:t>Broken out on DF11 Header</w:t>
+            </w:r>
+          </w:p>
+        </w:tc>
+        <w:tc>
+          <w:tcPr>
+            <w:tcW w:w="6572" w:type="dxa"/>
+          </w:tcPr>
+          <w:p/>
         </w:tc>
       </w:tr>
       <w:tr>
@@ -5637,42 +5625,32 @@
         </w:trPr>
         <w:tc>
           <w:tcPr>
-            <w:tcW w:w="1296" w:type="dxa"/>
-          </w:tcPr>
-          <w:p>
-            <w:r>
-              <w:rPr>
-                <w:sz w:val="16"/>
-              </w:rPr>
-              <w:t>GPIO20</w:t>
-            </w:r>
-          </w:p>
-        </w:tc>
-        <w:tc>
-          <w:tcPr>
-            <w:tcW w:w="2880" w:type="dxa"/>
-          </w:tcPr>
-          <w:p>
-            <w:r>
-              <w:rPr>
-                <w:sz w:val="16"/>
-              </w:rPr>
-              <w:t>FAULT_LED</w:t>
-            </w:r>
-          </w:p>
-        </w:tc>
-        <w:tc>
-          <w:tcPr>
-            <w:tcW w:w="6624" w:type="dxa"/>
-          </w:tcPr>
-          <w:p>
-            <w:r>
-              <w:rPr>
-                <w:sz w:val="16"/>
-              </w:rPr>
-              <w:t>Fault/status LED</w:t>
-            </w:r>
-          </w:p>
+            <w:tcW w:w="1291" w:type="dxa"/>
+          </w:tcPr>
+          <w:p>
+            <w:r>
+              <w:rPr>
+                <w:sz w:val="16"/>
+              </w:rPr>
+              <w:t>GPIO21</w:t>
+            </w:r>
+          </w:p>
+        </w:tc>
+        <w:tc>
+          <w:tcPr>
+            <w:tcW w:w="2865" w:type="dxa"/>
+          </w:tcPr>
+          <w:p>
+            <w:r>
+              <w:t>Broken out on DF11 Header</w:t>
+            </w:r>
+          </w:p>
+        </w:tc>
+        <w:tc>
+          <w:tcPr>
+            <w:tcW w:w="6572" w:type="dxa"/>
+          </w:tcPr>
+          <w:p/>
         </w:tc>
       </w:tr>
       <w:tr>
@@ -5681,42 +5659,32 @@
         </w:trPr>
         <w:tc>
           <w:tcPr>
-            <w:tcW w:w="1296" w:type="dxa"/>
-          </w:tcPr>
-          <w:p>
-            <w:r>
-              <w:rPr>
-                <w:sz w:val="16"/>
-              </w:rPr>
-              <w:t>GPIO21</w:t>
-            </w:r>
-          </w:p>
-        </w:tc>
-        <w:tc>
-          <w:tcPr>
-            <w:tcW w:w="2880" w:type="dxa"/>
-          </w:tcPr>
-          <w:p>
-            <w:r>
-              <w:rPr>
-                <w:sz w:val="16"/>
-              </w:rPr>
-              <w:t>DEBUG_UART_TX</w:t>
-            </w:r>
-          </w:p>
-        </w:tc>
-        <w:tc>
-          <w:tcPr>
-            <w:tcW w:w="6624" w:type="dxa"/>
-          </w:tcPr>
-          <w:p>
-            <w:r>
-              <w:rPr>
-                <w:sz w:val="16"/>
-              </w:rPr>
-              <w:t>Optional debug UART</w:t>
-            </w:r>
-          </w:p>
+            <w:tcW w:w="1291" w:type="dxa"/>
+          </w:tcPr>
+          <w:p>
+            <w:r>
+              <w:rPr>
+                <w:sz w:val="16"/>
+              </w:rPr>
+              <w:t>GPIO22</w:t>
+            </w:r>
+          </w:p>
+        </w:tc>
+        <w:tc>
+          <w:tcPr>
+            <w:tcW w:w="2865" w:type="dxa"/>
+          </w:tcPr>
+          <w:p>
+            <w:r>
+              <w:t>Broken out on DF11 Header</w:t>
+            </w:r>
+          </w:p>
+        </w:tc>
+        <w:tc>
+          <w:tcPr>
+            <w:tcW w:w="6572" w:type="dxa"/>
+          </w:tcPr>
+          <w:p/>
         </w:tc>
       </w:tr>
       <w:tr>
@@ -5725,42 +5693,32 @@
         </w:trPr>
         <w:tc>
           <w:tcPr>
-            <w:tcW w:w="1296" w:type="dxa"/>
-          </w:tcPr>
-          <w:p>
-            <w:r>
-              <w:rPr>
-                <w:sz w:val="16"/>
-              </w:rPr>
-              <w:t>GPIO22</w:t>
-            </w:r>
-          </w:p>
-        </w:tc>
-        <w:tc>
-          <w:tcPr>
-            <w:tcW w:w="2880" w:type="dxa"/>
-          </w:tcPr>
-          <w:p>
-            <w:r>
-              <w:rPr>
-                <w:sz w:val="16"/>
-              </w:rPr>
-              <w:t>DEBUG_UART_RX</w:t>
-            </w:r>
-          </w:p>
-        </w:tc>
-        <w:tc>
-          <w:tcPr>
-            <w:tcW w:w="6624" w:type="dxa"/>
-          </w:tcPr>
-          <w:p>
-            <w:r>
-              <w:rPr>
-                <w:sz w:val="16"/>
-              </w:rPr>
-              <w:t>Optional debug UART</w:t>
-            </w:r>
-          </w:p>
+            <w:tcW w:w="1291" w:type="dxa"/>
+          </w:tcPr>
+          <w:p>
+            <w:r>
+              <w:rPr>
+                <w:sz w:val="16"/>
+              </w:rPr>
+              <w:t>GPIO23</w:t>
+            </w:r>
+          </w:p>
+        </w:tc>
+        <w:tc>
+          <w:tcPr>
+            <w:tcW w:w="2865" w:type="dxa"/>
+          </w:tcPr>
+          <w:p>
+            <w:r>
+              <w:t>Broken out on DF11 Header</w:t>
+            </w:r>
+          </w:p>
+        </w:tc>
+        <w:tc>
+          <w:tcPr>
+            <w:tcW w:w="6572" w:type="dxa"/>
+          </w:tcPr>
+          <w:p/>
         </w:tc>
       </w:tr>
       <w:tr>
@@ -5769,42 +5727,32 @@
         </w:trPr>
         <w:tc>
           <w:tcPr>
-            <w:tcW w:w="1296" w:type="dxa"/>
-          </w:tcPr>
-          <w:p>
-            <w:r>
-              <w:rPr>
-                <w:sz w:val="16"/>
-              </w:rPr>
-              <w:t>GPIO23</w:t>
-            </w:r>
-          </w:p>
-        </w:tc>
-        <w:tc>
-          <w:tcPr>
-            <w:tcW w:w="2880" w:type="dxa"/>
-          </w:tcPr>
-          <w:p>
-            <w:r>
-              <w:rPr>
-                <w:sz w:val="16"/>
-              </w:rPr>
-              <w:t>DRIVE_FAULT_SUM_IN</w:t>
-            </w:r>
-          </w:p>
-        </w:tc>
-        <w:tc>
-          <w:tcPr>
-            <w:tcW w:w="6624" w:type="dxa"/>
-          </w:tcPr>
-          <w:p>
-            <w:r>
-              <w:rPr>
-                <w:sz w:val="16"/>
-              </w:rPr>
-              <w:t>Optional wired/fault summary input</w:t>
-            </w:r>
-          </w:p>
+            <w:tcW w:w="1291" w:type="dxa"/>
+          </w:tcPr>
+          <w:p>
+            <w:r>
+              <w:rPr>
+                <w:sz w:val="16"/>
+              </w:rPr>
+              <w:t>GPIO24</w:t>
+            </w:r>
+          </w:p>
+        </w:tc>
+        <w:tc>
+          <w:tcPr>
+            <w:tcW w:w="2865" w:type="dxa"/>
+          </w:tcPr>
+          <w:p>
+            <w:r>
+              <w:t>Broken out on DF11 Header</w:t>
+            </w:r>
+          </w:p>
+        </w:tc>
+        <w:tc>
+          <w:tcPr>
+            <w:tcW w:w="6572" w:type="dxa"/>
+          </w:tcPr>
+          <w:p/>
         </w:tc>
       </w:tr>
       <w:tr>
@@ -5813,42 +5761,32 @@
         </w:trPr>
         <w:tc>
           <w:tcPr>
-            <w:tcW w:w="1296" w:type="dxa"/>
-          </w:tcPr>
-          <w:p>
-            <w:r>
-              <w:rPr>
-                <w:sz w:val="16"/>
-              </w:rPr>
-              <w:t>GPIO24</w:t>
-            </w:r>
-          </w:p>
-        </w:tc>
-        <w:tc>
-          <w:tcPr>
-            <w:tcW w:w="2880" w:type="dxa"/>
-          </w:tcPr>
-          <w:p>
-            <w:r>
-              <w:rPr>
-                <w:sz w:val="16"/>
-              </w:rPr>
-              <w:t>ARM_SCI_FAULT_SUM_IN</w:t>
-            </w:r>
-          </w:p>
-        </w:tc>
-        <w:tc>
-          <w:tcPr>
-            <w:tcW w:w="6624" w:type="dxa"/>
-          </w:tcPr>
-          <w:p>
-            <w:r>
-              <w:rPr>
-                <w:sz w:val="16"/>
-              </w:rPr>
-              <w:t>Optional wired/fault summary input</w:t>
-            </w:r>
-          </w:p>
+            <w:tcW w:w="1291" w:type="dxa"/>
+          </w:tcPr>
+          <w:p>
+            <w:r>
+              <w:rPr>
+                <w:sz w:val="16"/>
+              </w:rPr>
+              <w:t>GPIO25</w:t>
+            </w:r>
+          </w:p>
+        </w:tc>
+        <w:tc>
+          <w:tcPr>
+            <w:tcW w:w="2865" w:type="dxa"/>
+          </w:tcPr>
+          <w:p>
+            <w:r>
+              <w:t>Broken out on DF11 Header</w:t>
+            </w:r>
+          </w:p>
+        </w:tc>
+        <w:tc>
+          <w:tcPr>
+            <w:tcW w:w="6572" w:type="dxa"/>
+          </w:tcPr>
+          <w:p/>
         </w:tc>
       </w:tr>
       <w:tr>
@@ -5857,42 +5795,32 @@
         </w:trPr>
         <w:tc>
           <w:tcPr>
-            <w:tcW w:w="1296" w:type="dxa"/>
-          </w:tcPr>
-          <w:p>
-            <w:r>
-              <w:rPr>
-                <w:sz w:val="16"/>
-              </w:rPr>
-              <w:t>GPIO25</w:t>
-            </w:r>
-          </w:p>
-        </w:tc>
-        <w:tc>
-          <w:tcPr>
-            <w:tcW w:w="2880" w:type="dxa"/>
-          </w:tcPr>
-          <w:p>
-            <w:r>
-              <w:rPr>
-                <w:sz w:val="16"/>
-              </w:rPr>
-              <w:t>LOGIC_FAULT_IN</w:t>
-            </w:r>
-          </w:p>
-        </w:tc>
-        <w:tc>
-          <w:tcPr>
-            <w:tcW w:w="6624" w:type="dxa"/>
-          </w:tcPr>
-          <w:p>
-            <w:r>
-              <w:rPr>
-                <w:sz w:val="16"/>
-              </w:rPr>
-              <w:t>Optional logic-domain fault input</w:t>
-            </w:r>
-          </w:p>
+            <w:tcW w:w="1291" w:type="dxa"/>
+          </w:tcPr>
+          <w:p>
+            <w:r>
+              <w:rPr>
+                <w:sz w:val="16"/>
+              </w:rPr>
+              <w:t>GPIO26</w:t>
+            </w:r>
+          </w:p>
+        </w:tc>
+        <w:tc>
+          <w:tcPr>
+            <w:tcW w:w="2865" w:type="dxa"/>
+          </w:tcPr>
+          <w:p>
+            <w:r>
+              <w:t>Broken out on DF11 Header</w:t>
+            </w:r>
+          </w:p>
+        </w:tc>
+        <w:tc>
+          <w:tcPr>
+            <w:tcW w:w="6572" w:type="dxa"/>
+          </w:tcPr>
+          <w:p/>
         </w:tc>
       </w:tr>
       <w:tr>
@@ -5901,42 +5829,32 @@
         </w:trPr>
         <w:tc>
           <w:tcPr>
-            <w:tcW w:w="1296" w:type="dxa"/>
-          </w:tcPr>
-          <w:p>
-            <w:r>
-              <w:rPr>
-                <w:sz w:val="16"/>
-              </w:rPr>
-              <w:t>GPIO26</w:t>
-            </w:r>
-          </w:p>
-        </w:tc>
-        <w:tc>
-          <w:tcPr>
-            <w:tcW w:w="2880" w:type="dxa"/>
-          </w:tcPr>
-          <w:p>
-            <w:r>
-              <w:rPr>
-                <w:sz w:val="16"/>
-              </w:rPr>
-              <w:t>VLOGIC_ADC_SPARE</w:t>
-            </w:r>
-          </w:p>
-        </w:tc>
-        <w:tc>
-          <w:tcPr>
-            <w:tcW w:w="6624" w:type="dxa"/>
-          </w:tcPr>
-          <w:p>
-            <w:r>
-              <w:rPr>
-                <w:sz w:val="16"/>
-              </w:rPr>
-              <w:t>Optional ADC sanity check / spare</w:t>
-            </w:r>
-          </w:p>
+            <w:tcW w:w="1291" w:type="dxa"/>
+          </w:tcPr>
+          <w:p>
+            <w:r>
+              <w:rPr>
+                <w:sz w:val="16"/>
+              </w:rPr>
+              <w:t>GPIO27</w:t>
+            </w:r>
+          </w:p>
+        </w:tc>
+        <w:tc>
+          <w:tcPr>
+            <w:tcW w:w="2865" w:type="dxa"/>
+          </w:tcPr>
+          <w:p>
+            <w:r>
+              <w:t>Broken out on DF11 Header</w:t>
+            </w:r>
+          </w:p>
+        </w:tc>
+        <w:tc>
+          <w:tcPr>
+            <w:tcW w:w="6572" w:type="dxa"/>
+          </w:tcPr>
+          <w:p/>
         </w:tc>
       </w:tr>
       <w:tr>
@@ -5945,42 +5863,28 @@
         </w:trPr>
         <w:tc>
           <w:tcPr>
-            <w:tcW w:w="1296" w:type="dxa"/>
-          </w:tcPr>
-          <w:p>
-            <w:r>
-              <w:rPr>
-                <w:sz w:val="16"/>
-              </w:rPr>
-              <w:t>GPIO27</w:t>
-            </w:r>
-          </w:p>
-        </w:tc>
-        <w:tc>
-          <w:tcPr>
-            <w:tcW w:w="2880" w:type="dxa"/>
-          </w:tcPr>
-          <w:p>
-            <w:r>
-              <w:rPr>
-                <w:sz w:val="16"/>
-              </w:rPr>
-              <w:t>VDRIVE_ADC_SPARE</w:t>
-            </w:r>
-          </w:p>
-        </w:tc>
-        <w:tc>
-          <w:tcPr>
-            <w:tcW w:w="6624" w:type="dxa"/>
-          </w:tcPr>
-          <w:p>
-            <w:r>
-              <w:rPr>
-                <w:sz w:val="16"/>
-              </w:rPr>
-              <w:t>Optional ADC sanity check / spare</w:t>
-            </w:r>
-          </w:p>
+            <w:tcW w:w="1291" w:type="dxa"/>
+          </w:tcPr>
+          <w:p>
+            <w:r>
+              <w:rPr>
+                <w:sz w:val="16"/>
+              </w:rPr>
+              <w:t>GPIO28</w:t>
+            </w:r>
+          </w:p>
+        </w:tc>
+        <w:tc>
+          <w:tcPr>
+            <w:tcW w:w="2865" w:type="dxa"/>
+          </w:tcPr>
+          <w:p/>
+        </w:tc>
+        <w:tc>
+          <w:tcPr>
+            <w:tcW w:w="6572" w:type="dxa"/>
+          </w:tcPr>
+          <w:p/>
         </w:tc>
       </w:tr>
       <w:tr>
@@ -5989,51 +5893,7 @@
         </w:trPr>
         <w:tc>
           <w:tcPr>
-            <w:tcW w:w="1296" w:type="dxa"/>
-          </w:tcPr>
-          <w:p>
-            <w:r>
-              <w:rPr>
-                <w:sz w:val="16"/>
-              </w:rPr>
-              <w:t>GPIO28</w:t>
-            </w:r>
-          </w:p>
-        </w:tc>
-        <w:tc>
-          <w:tcPr>
-            <w:tcW w:w="2880" w:type="dxa"/>
-          </w:tcPr>
-          <w:p>
-            <w:r>
-              <w:rPr>
-                <w:sz w:val="16"/>
-              </w:rPr>
-              <w:t>VARM_SCI_ADC_SPARE</w:t>
-            </w:r>
-          </w:p>
-        </w:tc>
-        <w:tc>
-          <w:tcPr>
-            <w:tcW w:w="6624" w:type="dxa"/>
-          </w:tcPr>
-          <w:p>
-            <w:r>
-              <w:rPr>
-                <w:sz w:val="16"/>
-              </w:rPr>
-              <w:t>Optional ADC sanity check / spare</w:t>
-            </w:r>
-          </w:p>
-        </w:tc>
-      </w:tr>
-      <w:tr>
-        <w:trPr>
-          <w:jc w:val="center"/>
-        </w:trPr>
-        <w:tc>
-          <w:tcPr>
-            <w:tcW w:w="1296" w:type="dxa"/>
+            <w:tcW w:w="1291" w:type="dxa"/>
           </w:tcPr>
           <w:p>
             <w:r>
@@ -6046,29 +5906,15 @@
         </w:tc>
         <w:tc>
           <w:tcPr>
-            <w:tcW w:w="2880" w:type="dxa"/>
-          </w:tcPr>
-          <w:p>
-            <w:r>
-              <w:rPr>
-                <w:sz w:val="16"/>
-              </w:rPr>
-              <w:t>SPARE_ADC_OR_BUTTON</w:t>
-            </w:r>
-          </w:p>
-        </w:tc>
-        <w:tc>
-          <w:tcPr>
-            <w:tcW w:w="6624" w:type="dxa"/>
-          </w:tcPr>
-          <w:p>
-            <w:r>
-              <w:rPr>
-                <w:sz w:val="16"/>
-              </w:rPr>
-              <w:t>Spare ADC or user/service button</w:t>
-            </w:r>
-          </w:p>
+            <w:tcW w:w="2865" w:type="dxa"/>
+          </w:tcPr>
+          <w:p/>
+        </w:tc>
+        <w:tc>
+          <w:tcPr>
+            <w:tcW w:w="6572" w:type="dxa"/>
+          </w:tcPr>
+          <w:p/>
         </w:tc>
       </w:tr>
     </w:tbl>
@@ -6083,7 +5929,15 @@
         <w:spacing w:before="160" w:after="80"/>
       </w:pPr>
       <w:r>
-        <w:t>6.3 Buffer and AND Gate Channel Use</w:t>
+        <w:t xml:space="preserve">6.3 Buffer and </w:t>
+      </w:r>
+      <w:proofErr w:type="spellStart"/>
+      <w:r>
+        <w:t>AND</w:t>
+      </w:r>
+      <w:proofErr w:type="spellEnd"/>
+      <w:r>
+        <w:t xml:space="preserve"> Gate Channel Use</w:t>
       </w:r>
     </w:p>
     <w:tbl>
@@ -6846,22 +6700,53 @@
       </w:r>
       <w:r>
         <w:br/>
-        <w:t xml:space="preserve">  temp_logic     @ 0x18</w:t>
+        <w:t xml:space="preserve">  </w:t>
+      </w:r>
+      <w:proofErr w:type="spellStart"/>
+      <w:r>
+        <w:t>temp_logic</w:t>
+      </w:r>
+      <w:proofErr w:type="spellEnd"/>
+      <w:r>
+        <w:t xml:space="preserve">     @ 0x18</w:t>
       </w:r>
       <w:r>
         <w:br/>
-        <w:t xml:space="preserve">  temp_drive     @ 0x19</w:t>
+        <w:t xml:space="preserve">  </w:t>
+      </w:r>
+      <w:proofErr w:type="spellStart"/>
+      <w:r>
+        <w:t>temp_drive</w:t>
+      </w:r>
+      <w:proofErr w:type="spellEnd"/>
+      <w:r>
+        <w:t xml:space="preserve">     @ 0x19</w:t>
       </w:r>
       <w:r>
         <w:br/>
-        <w:t xml:space="preserve">  temp_arm_sci   @ 0x1A</w:t>
+        <w:t xml:space="preserve">  </w:t>
+      </w:r>
+      <w:proofErr w:type="spellStart"/>
+      <w:r>
+        <w:t>temp_arm_sci</w:t>
+      </w:r>
+      <w:proofErr w:type="spellEnd"/>
+      <w:r>
+        <w:t xml:space="preserve">   @ 0x1A</w:t>
       </w:r>
       <w:r>
         <w:br/>
       </w:r>
       <w:r>
         <w:br/>
-        <w:t>gpio outputs:</w:t>
+      </w:r>
+      <w:proofErr w:type="spellStart"/>
+      <w:r>
+        <w:t>gpio</w:t>
+      </w:r>
+      <w:proofErr w:type="spellEnd"/>
+      <w:r>
+        <w:t xml:space="preserve"> outputs:</w:t>
       </w:r>
       <w:r>
         <w:br/>
@@ -6869,57 +6754,48 @@
       </w:r>
       <w:r>
         <w:br/>
-        <w:t xml:space="preserve">  arm_en</w:t>
-      </w:r>
+        <w:t xml:space="preserve">  </w:t>
+      </w:r>
+      <w:proofErr w:type="spellStart"/>
+      <w:r>
+        <w:t>arm_en</w:t>
+      </w:r>
+      <w:proofErr w:type="spellEnd"/>
       <w:r>
         <w:br/>
-        <w:t xml:space="preserve">  science_en</w:t>
-      </w:r>
+        <w:t xml:space="preserve">  </w:t>
+      </w:r>
+      <w:proofErr w:type="spellStart"/>
+      <w:r>
+        <w:t>science_en</w:t>
+      </w:r>
+      <w:proofErr w:type="spellEnd"/>
       <w:r>
         <w:br/>
-        <w:t xml:space="preserve">  aux_22_en</w:t>
-      </w:r>
-      <w:r>
+      </w:r>
+      <w:r>
+        <w:lastRenderedPageBreak/>
         <w:br/>
       </w:r>
-      <w:r>
-        <w:lastRenderedPageBreak/>
-        <w:t xml:space="preserve">  pdb_fault_out</w:t>
+      <w:proofErr w:type="spellStart"/>
+      <w:r>
+        <w:t>gpio</w:t>
+      </w:r>
+      <w:proofErr w:type="spellEnd"/>
+      <w:r>
+        <w:t xml:space="preserve"> inputs:</w:t>
       </w:r>
       <w:r>
         <w:br/>
-        <w:t xml:space="preserve">  tca4307_i2c0_en</w:t>
-      </w:r>
+        <w:t xml:space="preserve">  </w:t>
+      </w:r>
+      <w:proofErr w:type="spellStart"/>
+      <w:r>
+        <w:t>e_stop_status</w:t>
+      </w:r>
+      <w:proofErr w:type="spellEnd"/>
       <w:r>
         <w:br/>
-        <w:t xml:space="preserve">  tca4307_i2c1_en</w:t>
-      </w:r>
-      <w:r>
-        <w:br/>
-      </w:r>
-      <w:r>
-        <w:br/>
-        <w:t>gpio inputs:</w:t>
-      </w:r>
-      <w:r>
-        <w:br/>
-        <w:t xml:space="preserve">  e_stop_status</w:t>
-      </w:r>
-      <w:r>
-        <w:br/>
-        <w:t xml:space="preserve">  jetson_heartbeat_in</w:t>
-      </w:r>
-      <w:r>
-        <w:br/>
-        <w:t xml:space="preserve">  drive_fault_sum_in</w:t>
-      </w:r>
-      <w:r>
-        <w:br/>
-        <w:t xml:space="preserve">  arm_sci_fault_sum_in</w:t>
-      </w:r>
-      <w:r>
-        <w:br/>
-        <w:t xml:space="preserve">  logic_fault_in</w:t>
       </w:r>
     </w:p>
     <w:p>
@@ -7187,8 +7063,13 @@
         <w:spacing w:before="160" w:after="80"/>
       </w:pPr>
       <w:r>
-        <w:t>7.2 Recommended Stackup</w:t>
-      </w:r>
+        <w:t xml:space="preserve">7.2 Recommended </w:t>
+      </w:r>
+      <w:proofErr w:type="spellStart"/>
+      <w:r>
+        <w:t>Stackup</w:t>
+      </w:r>
+      <w:proofErr w:type="spellEnd"/>
     </w:p>
     <w:p>
       <w:pPr>
@@ -7627,8 +7508,15 @@
         <w:spacing w:before="160" w:after="80"/>
       </w:pPr>
       <w:r>
-        <w:lastRenderedPageBreak/>
-        <w:t>8. KiCad Schematic Sheet Plan</w:t>
+        <w:t xml:space="preserve">8. </w:t>
+      </w:r>
+      <w:proofErr w:type="spellStart"/>
+      <w:r>
+        <w:t>KiCad</w:t>
+      </w:r>
+      <w:proofErr w:type="spellEnd"/>
+      <w:r>
+        <w:t xml:space="preserve"> Schematic Sheet Plan</w:t>
       </w:r>
     </w:p>
     <w:tbl>
@@ -7743,7 +7631,14 @@
               <w:rPr>
                 <w:sz w:val="16"/>
               </w:rPr>
-              <w:t>Three XT60 battery inputs, E-stop screw terminal, E_STOP_NODE conditioning, full-system disconnect interface, input TVS/protection.</w:t>
+              <w:t xml:space="preserve">Three XT60 battery inputs, E-stop screw terminal, E_STOP_NODE conditioning, full-system disconnect interface, </w:t>
+            </w:r>
+            <w:r>
+              <w:rPr>
+                <w:sz w:val="16"/>
+              </w:rPr>
+              <w:lastRenderedPageBreak/>
+              <w:t>input TVS/protection.</w:t>
             </w:r>
           </w:p>
         </w:tc>
@@ -7761,6 +7656,7 @@
               <w:rPr>
                 <w:sz w:val="16"/>
               </w:rPr>
+              <w:lastRenderedPageBreak/>
               <w:t>02_RP2350_CONTROLLER</w:t>
             </w:r>
           </w:p>
@@ -8469,64 +8365,102 @@
       </w:r>
       <w:r>
         <w:br/>
-        <w:t>faults</w:t>
-      </w:r>
+        <w:t xml:space="preserve">rail drive1 </w:t>
+      </w:r>
+      <w:proofErr w:type="spellStart"/>
+      <w:r>
+        <w:t>on|off</w:t>
+      </w:r>
+      <w:proofErr w:type="spellEnd"/>
       <w:r>
         <w:br/>
-        <w:t>faults clear</w:t>
-      </w:r>
+        <w:t xml:space="preserve">rail drive2 </w:t>
+      </w:r>
+      <w:proofErr w:type="spellStart"/>
+      <w:r>
+        <w:t>on|off</w:t>
+      </w:r>
+      <w:proofErr w:type="spellEnd"/>
       <w:r>
         <w:br/>
-        <w:t>rail drive1 on|off</w:t>
-      </w:r>
+        <w:t xml:space="preserve">rail drive3 </w:t>
+      </w:r>
+      <w:proofErr w:type="spellStart"/>
+      <w:r>
+        <w:t>on|off</w:t>
+      </w:r>
+      <w:proofErr w:type="spellEnd"/>
       <w:r>
         <w:br/>
-        <w:t>rail drive2 on|off</w:t>
-      </w:r>
+        <w:t xml:space="preserve">rail drive4 </w:t>
+      </w:r>
+      <w:proofErr w:type="spellStart"/>
+      <w:r>
+        <w:t>on|off</w:t>
+      </w:r>
+      <w:proofErr w:type="spellEnd"/>
       <w:r>
         <w:br/>
-        <w:t>rail drive3 on|off</w:t>
-      </w:r>
+        <w:t xml:space="preserve">rail drive5 </w:t>
+      </w:r>
+      <w:proofErr w:type="spellStart"/>
+      <w:r>
+        <w:t>on|off</w:t>
+      </w:r>
+      <w:proofErr w:type="spellEnd"/>
       <w:r>
         <w:br/>
-        <w:t>rail drive4 on|off</w:t>
-      </w:r>
+        <w:t xml:space="preserve">rail drive6 </w:t>
+      </w:r>
+      <w:proofErr w:type="spellStart"/>
+      <w:r>
+        <w:t>on|off</w:t>
+      </w:r>
+      <w:proofErr w:type="spellEnd"/>
       <w:r>
         <w:br/>
-        <w:t>rail drive5 on|off</w:t>
-      </w:r>
+        <w:t xml:space="preserve">rail </w:t>
+      </w:r>
+      <w:proofErr w:type="spellStart"/>
+      <w:r>
+        <w:t>drive_all</w:t>
+      </w:r>
+      <w:proofErr w:type="spellEnd"/>
+      <w:r>
+        <w:t xml:space="preserve"> </w:t>
+      </w:r>
+      <w:proofErr w:type="spellStart"/>
+      <w:r>
+        <w:t>on|off</w:t>
+      </w:r>
+      <w:proofErr w:type="spellEnd"/>
       <w:r>
         <w:br/>
-        <w:t>rail drive6 on|off</w:t>
-      </w:r>
+        <w:t xml:space="preserve">rail arm </w:t>
+      </w:r>
+      <w:proofErr w:type="spellStart"/>
+      <w:r>
+        <w:t>on|off</w:t>
+      </w:r>
+      <w:proofErr w:type="spellEnd"/>
       <w:r>
         <w:br/>
-        <w:t>rail drive_all on|off</w:t>
-      </w:r>
+        <w:t xml:space="preserve">rail science </w:t>
+      </w:r>
+      <w:proofErr w:type="spellStart"/>
+      <w:r>
+        <w:t>on|off</w:t>
+      </w:r>
+      <w:proofErr w:type="spellEnd"/>
       <w:r>
         <w:br/>
-        <w:t>rail arm on|off</w:t>
-      </w:r>
-      <w:r>
-        <w:br/>
-        <w:t>rail science on|off</w:t>
-      </w:r>
-      <w:r>
-        <w:br/>
-        <w:t>rail aux22 on|off</w:t>
-      </w:r>
-      <w:r>
-        <w:br/>
-        <w:t>high_power disable</w:t>
-      </w:r>
-      <w:r>
-        <w:br/>
-        <w:t>heartbeat</w:t>
-      </w:r>
-      <w:r>
-        <w:br/>
-        <w:t>reboot_controller</w:t>
-      </w:r>
+        <w:t xml:space="preserve">rail aux22 </w:t>
+      </w:r>
+      <w:proofErr w:type="spellStart"/>
+      <w:r>
+        <w:t>on|off</w:t>
+      </w:r>
+      <w:proofErr w:type="spellEnd"/>
     </w:p>
     <w:p>
       <w:pPr>
@@ -8534,7 +8468,6 @@
         <w:spacing w:before="160" w:after="80"/>
       </w:pPr>
       <w:r>
-        <w:lastRenderedPageBreak/>
         <w:t>10. Validation and Bring-Up Plan</w:t>
       </w:r>
     </w:p>
@@ -8571,7 +8504,15 @@
         <w:spacing w:after="60"/>
       </w:pPr>
       <w:r>
-        <w:t>Run GPIO self-test into buffers and AND gates with no power stages populated if possible.</w:t>
+        <w:t xml:space="preserve">Run GPIO self-test into buffers and </w:t>
+      </w:r>
+      <w:proofErr w:type="spellStart"/>
+      <w:r>
+        <w:t>AND</w:t>
+      </w:r>
+      <w:proofErr w:type="spellEnd"/>
+      <w:r>
+        <w:t xml:space="preserve"> gates with no power stages populated if possible.</w:t>
       </w:r>
     </w:p>
     <w:p>
@@ -8598,6 +8539,7 @@
         <w:spacing w:after="60"/>
       </w:pPr>
       <w:r>
+        <w:lastRenderedPageBreak/>
         <w:t>Bring up I2C0 with no high-current load. Probe all INA780x addresses.</w:t>
       </w:r>
     </w:p>
@@ -8715,7 +8657,15 @@
         <w:spacing w:after="60"/>
       </w:pPr>
       <w:r>
-        <w:t>Every symbol exists in KiCad and matches the datasheet pinout.</w:t>
+        <w:t xml:space="preserve">Every symbol exists in </w:t>
+      </w:r>
+      <w:proofErr w:type="spellStart"/>
+      <w:r>
+        <w:t>KiCad</w:t>
+      </w:r>
+      <w:proofErr w:type="spellEnd"/>
+      <w:r>
+        <w:t xml:space="preserve"> and matches the datasheet pinout.</w:t>
       </w:r>
     </w:p>
     <w:p>
@@ -8724,7 +8674,15 @@
         <w:spacing w:after="60"/>
       </w:pPr>
       <w:r>
-        <w:t>Every footprint exists in KiCad and matches the manufacturer land pattern.</w:t>
+        <w:t xml:space="preserve">Every footprint exists in </w:t>
+      </w:r>
+      <w:proofErr w:type="spellStart"/>
+      <w:r>
+        <w:t>KiCad</w:t>
+      </w:r>
+      <w:proofErr w:type="spellEnd"/>
+      <w:r>
+        <w:t xml:space="preserve"> and matches the manufacturer land pattern.</w:t>
       </w:r>
     </w:p>
     <w:p>
@@ -8958,7 +8916,6 @@
         <w:spacing w:after="60"/>
       </w:pPr>
       <w:r>
-        <w:lastRenderedPageBreak/>
         <w:t>Firmware refuses to enable outputs when E-stop is asserted.</w:t>
       </w:r>
     </w:p>
@@ -8986,7 +8943,15 @@
         <w:spacing w:after="60"/>
       </w:pPr>
       <w:r>
-        <w:t>Firmware implements high_power disable command.</w:t>
+        <w:t xml:space="preserve">Firmware implements </w:t>
+      </w:r>
+      <w:proofErr w:type="spellStart"/>
+      <w:r>
+        <w:t>high_power</w:t>
+      </w:r>
+      <w:proofErr w:type="spellEnd"/>
+      <w:r>
+        <w:t xml:space="preserve"> disable command.</w:t>
       </w:r>
     </w:p>
     <w:p>
@@ -9004,6 +8969,7 @@
         <w:spacing w:before="160" w:after="80"/>
       </w:pPr>
       <w:r>
+        <w:lastRenderedPageBreak/>
         <w:t>12. Open Verification Items</w:t>
       </w:r>
     </w:p>
@@ -9209,7 +9175,15 @@
           </w:tcPr>
           <w:p>
             <w:r>
-              <w:t>Compare final controller sheet against Raspberry Pi official minimal design and the Bronco Space Lab BLVLink hardware v2.0 reference design before PCB routing.</w:t>
+              <w:t xml:space="preserve">Compare final controller sheet against Raspberry Pi official minimal design and the Bronco Space Lab </w:t>
+            </w:r>
+            <w:proofErr w:type="spellStart"/>
+            <w:r>
+              <w:t>BLVLink</w:t>
+            </w:r>
+            <w:proofErr w:type="spellEnd"/>
+            <w:r>
+              <w:t xml:space="preserve"> hardware v2.0 reference design before PCB routing.</w:t>
             </w:r>
           </w:p>
         </w:tc>
@@ -9386,7 +9360,23 @@
                   <w:color w:val="0563C1"/>
                   <w:u w:val="single"/>
                 </w:rPr>
-                <w:t>Bronco Space Lab BLVLink hardware v2.0 GitHub repository</w:t>
+                <w:t xml:space="preserve">Bronco Space Lab </w:t>
+              </w:r>
+              <w:proofErr w:type="spellStart"/>
+              <w:r>
+                <w:rPr>
+                  <w:color w:val="0563C1"/>
+                  <w:u w:val="single"/>
+                </w:rPr>
+                <w:t>BLVLink</w:t>
+              </w:r>
+              <w:proofErr w:type="spellEnd"/>
+              <w:r>
+                <w:rPr>
+                  <w:color w:val="0563C1"/>
+                  <w:u w:val="single"/>
+                </w:rPr>
+                <w:t xml:space="preserve"> hardware v2.0 GitHub repository</w:t>
               </w:r>
             </w:hyperlink>
           </w:p>
@@ -9397,7 +9387,15 @@
           </w:tcPr>
           <w:p>
             <w:r>
-              <w:t>RP2350 reference design cross-check. Use this repository to compare the custom controller sheet against known RP2350 support circuitry, including MCU schematic structure, USB, flash, crystal, SWD, BOOTSEL/RUN, and KiCad project organization before PCB routing.</w:t>
+              <w:t xml:space="preserve">RP2350 reference design cross-check. Use this repository to compare the custom controller sheet against known RP2350 support circuitry, including MCU schematic structure, USB, flash, crystal, SWD, BOOTSEL/RUN, and </w:t>
+            </w:r>
+            <w:proofErr w:type="spellStart"/>
+            <w:r>
+              <w:t>KiCad</w:t>
+            </w:r>
+            <w:proofErr w:type="spellEnd"/>
+            <w:r>
+              <w:t xml:space="preserve"> project organization before PCB routing.</w:t>
             </w:r>
           </w:p>
         </w:tc>
@@ -9628,8 +9626,13 @@
             <w:tcW w:w="5256" w:type="dxa"/>
           </w:tcPr>
           <w:p>
-            <w:r>
-              <w:t>Abracon ABM8-272-T3 listing</w:t>
+            <w:proofErr w:type="spellStart"/>
+            <w:r>
+              <w:t>Abracon</w:t>
+            </w:r>
+            <w:proofErr w:type="spellEnd"/>
+            <w:r>
+              <w:t xml:space="preserve"> ABM8-272-T3 listing</w:t>
             </w:r>
           </w:p>
         </w:tc>
@@ -10539,6 +10542,7 @@
   <w:style w:type="character" w:default="1" w:styleId="DefaultParagraphFont">
     <w:name w:val="Default Paragraph Font"/>
     <w:uiPriority w:val="1"/>
+    <w:semiHidden/>
     <w:unhideWhenUsed/>
   </w:style>
   <w:style w:type="table" w:default="1" w:styleId="TableNormal">

</xml_diff>

<commit_message>
Replaced GPIO buffer. Need to add reverse circuit protection. Still trying to figure out what to use
</commit_message>
<xml_diff>
--- a/BILLEE_Rover_Control_Module_V1/PDB_Engineering_Requirements_and_Design_Guide_Rev_G.docx
+++ b/BILLEE_Rover_Control_Module_V1/PDB_Engineering_Requirements_and_Design_Guide_Rev_G.docx
@@ -129,21 +129,7 @@
               <w:rPr>
                 <w:sz w:val="16"/>
               </w:rPr>
-              <w:t xml:space="preserve">Replaced onboard RP2040/Pico concept with bare RP2350A baseline controller. Updated GPIO allocation, I2C topology, Zephyr bindings, </w:t>
-            </w:r>
-            <w:proofErr w:type="spellStart"/>
-            <w:r>
-              <w:rPr>
-                <w:sz w:val="16"/>
-              </w:rPr>
-              <w:t>KiCad</w:t>
-            </w:r>
-            <w:proofErr w:type="spellEnd"/>
-            <w:r>
-              <w:rPr>
-                <w:sz w:val="16"/>
-              </w:rPr>
-              <w:t xml:space="preserve"> sheet plan, and LCSC part list. Kept six drivetrain MOSFET branches and split ARM/SCIENCE rails. Removed MCP23017 from baseline.</w:t>
+              <w:t>Replaced onboard RP2040/Pico concept with bare RP2350A baseline controller. Updated GPIO allocation, I2C topology, Zephyr bindings, KiCad sheet plan, and LCSC part list. Kept six drivetrain MOSFET branches and split ARM/SCIENCE rails. Removed MCP23017 from baseline.</w:t>
             </w:r>
           </w:p>
         </w:tc>
@@ -232,15 +218,7 @@
         <w:spacing w:after="60"/>
       </w:pPr>
       <w:r>
-        <w:t xml:space="preserve">8. </w:t>
-      </w:r>
-      <w:proofErr w:type="spellStart"/>
-      <w:r>
-        <w:t>KiCad</w:t>
-      </w:r>
-      <w:proofErr w:type="spellEnd"/>
-      <w:r>
-        <w:t xml:space="preserve"> Schematic Sheet Plan</w:t>
+        <w:t>8. KiCad Schematic Sheet Plan</w:t>
       </w:r>
     </w:p>
     <w:p>
@@ -303,15 +281,7 @@
         <w:spacing w:after="60"/>
       </w:pPr>
       <w:r>
-        <w:t xml:space="preserve">Use Sections 2 and 3 to teach the architecture before opening </w:t>
-      </w:r>
-      <w:proofErr w:type="spellStart"/>
-      <w:r>
-        <w:t>KiCad</w:t>
-      </w:r>
-      <w:proofErr w:type="spellEnd"/>
-      <w:r>
-        <w:t>.</w:t>
+        <w:t>Use Sections 2 and 3 to teach the architecture before opening KiCad.</w:t>
       </w:r>
     </w:p>
     <w:p>
@@ -419,15 +389,7 @@
         <w:spacing w:after="60"/>
       </w:pPr>
       <w:r>
-        <w:t xml:space="preserve">The schematic shall follow the Raspberry Pi RP2350 hardware design guide and the Bronco Space Lab </w:t>
-      </w:r>
-      <w:proofErr w:type="spellStart"/>
-      <w:r>
-        <w:t>BLVLink</w:t>
-      </w:r>
-      <w:proofErr w:type="spellEnd"/>
-      <w:r>
-        <w:t xml:space="preserve"> hardware v2.0 reference design for RP2350 support circuitry.</w:t>
+        <w:t>The schematic shall follow the Raspberry Pi RP2350 hardware design guide and the Bronco Space Lab BLVLink hardware v2.0 reference design for RP2350 support circuitry.</w:t>
       </w:r>
     </w:p>
     <w:p>
@@ -837,15 +799,7 @@
         <w:spacing w:after="60"/>
       </w:pPr>
       <w:r>
-        <w:t xml:space="preserve">Each drivetrain branch shall have one dedicated native RP2350 </w:t>
-      </w:r>
-      <w:proofErr w:type="spellStart"/>
-      <w:r>
-        <w:t>DRIVE_EN_x</w:t>
-      </w:r>
-      <w:proofErr w:type="spellEnd"/>
-      <w:r>
-        <w:t xml:space="preserve"> GPIO.</w:t>
+        <w:t>Each drivetrain branch shall have one dedicated native RP2350 DRIVE_EN_x GPIO.</w:t>
       </w:r>
     </w:p>
     <w:p>
@@ -854,15 +808,7 @@
         <w:spacing w:after="60"/>
       </w:pPr>
       <w:r>
-        <w:t xml:space="preserve">Each </w:t>
-      </w:r>
-      <w:proofErr w:type="spellStart"/>
-      <w:r>
-        <w:t>DRIVE_EN_x</w:t>
-      </w:r>
-      <w:proofErr w:type="spellEnd"/>
-      <w:r>
-        <w:t xml:space="preserve"> signal shall pass through the GPIO buffer and E-stop gate before reaching the gate-driver input.</w:t>
+        <w:t>Each DRIVE_EN_x signal shall pass through the GPIO buffer and E-stop gate before reaching the gate-driver input.</w:t>
       </w:r>
     </w:p>
     <w:p>
@@ -1078,15 +1024,7 @@
         <w:spacing w:after="60"/>
       </w:pPr>
       <w:r>
-        <w:t xml:space="preserve">The GPIO buffer and </w:t>
-      </w:r>
-      <w:proofErr w:type="spellStart"/>
-      <w:r>
-        <w:t>AND</w:t>
-      </w:r>
-      <w:proofErr w:type="spellEnd"/>
-      <w:r>
-        <w:t xml:space="preserve"> gates shall be powered from the 3.3 V housekeeping rail.</w:t>
+        <w:t>The GPIO buffer and AND gates shall be powered from the 3.3 V housekeeping rail.</w:t>
       </w:r>
     </w:p>
     <w:p>
@@ -1323,20 +1261,20 @@
       </w:r>
       <w:r>
         <w:br/>
-        <w:t xml:space="preserve">RP2350 </w:t>
-      </w:r>
-      <w:proofErr w:type="spellStart"/>
-      <w:r>
-        <w:t>DRIVE_EN_x</w:t>
-      </w:r>
-      <w:proofErr w:type="spellEnd"/>
+        <w:t>RP2350 DRIVE_EN_x</w:t>
+      </w:r>
       <w:r>
         <w:br/>
         <w:t xml:space="preserve">   |</w:t>
       </w:r>
       <w:r>
         <w:br/>
-        <w:t>SN74LVC244APWR GPIO buffer</w:t>
+      </w:r>
+      <w:r>
+        <w:t>TXS0108EPWR</w:t>
+      </w:r>
+      <w:r>
+        <w:t xml:space="preserve"> GPIO buffer</w:t>
       </w:r>
       <w:r>
         <w:br/>
@@ -2176,10 +2114,7 @@
           </w:tcPr>
           <w:p>
             <w:r>
-              <w:rPr>
-                <w:sz w:val="16"/>
-              </w:rPr>
-              <w:t>SN74LVC244APWR</w:t>
+              <w:t>TXS0108EPWR</w:t>
             </w:r>
           </w:p>
         </w:tc>
@@ -2192,7 +2127,7 @@
               <w:rPr>
                 <w:sz w:val="16"/>
               </w:rPr>
-              <w:t>C7668</w:t>
+              <w:t>C17206</w:t>
             </w:r>
           </w:p>
         </w:tc>
@@ -2215,10 +2150,7 @@
           </w:tcPr>
           <w:p>
             <w:r>
-              <w:rPr>
-                <w:sz w:val="16"/>
-              </w:rPr>
-              <w:t>2</w:t>
+              <w:t>1</w:t>
             </w:r>
           </w:p>
         </w:tc>
@@ -2231,7 +2163,19 @@
               <w:rPr>
                 <w:sz w:val="16"/>
               </w:rPr>
-              <w:t>Buffers all RP2350-controlled enable outputs. 16 total buffer channels.</w:t>
+              <w:t xml:space="preserve">Buffers all RP2350-controlled enable outputs. </w:t>
+            </w:r>
+            <w:r>
+              <w:rPr>
+                <w:sz w:val="16"/>
+              </w:rPr>
+              <w:t>1</w:t>
+            </w:r>
+            <w:r>
+              <w:rPr>
+                <w:sz w:val="16"/>
+              </w:rPr>
+              <w:t xml:space="preserve"> total buffer channels.</w:t>
             </w:r>
           </w:p>
         </w:tc>
@@ -2450,27 +2394,11 @@
             </w:r>
             <w:r>
               <w:br/>
-              <w:t xml:space="preserve">Since this </w:t>
-            </w:r>
-            <w:proofErr w:type="spellStart"/>
-            <w:r>
-              <w:t>mosfet</w:t>
-            </w:r>
-            <w:proofErr w:type="spellEnd"/>
-            <w:r>
-              <w:t xml:space="preserve"> after about ~8v reaches its </w:t>
+              <w:t xml:space="preserve">Since this mosfet after about ~8v reaches its </w:t>
             </w:r>
             <w:r>
               <w:lastRenderedPageBreak/>
-              <w:t xml:space="preserve">“peak” current capabilities, you can set the </w:t>
-            </w:r>
-            <w:proofErr w:type="spellStart"/>
-            <w:r>
-              <w:t>vcc</w:t>
-            </w:r>
-            <w:proofErr w:type="spellEnd"/>
-            <w:r>
-              <w:t xml:space="preserve"> of this to be on the 12v rail output</w:t>
+              <w:t>“peak” current capabilities, you can set the vcc of this to be on the 12v rail output</w:t>
             </w:r>
           </w:p>
         </w:tc>
@@ -2974,15 +2902,7 @@
               <w:br/>
             </w:r>
             <w:r>
-              <w:t xml:space="preserve">Jetson power + </w:t>
-            </w:r>
-            <w:proofErr w:type="spellStart"/>
-            <w:r>
-              <w:t>networkswitch</w:t>
-            </w:r>
-            <w:proofErr w:type="spellEnd"/>
-            <w:r>
-              <w:t xml:space="preserve"> + POE will use screw terminal blocks</w:t>
+              <w:t>Jetson power + networkswitch + POE will use screw terminal blocks</w:t>
             </w:r>
           </w:p>
         </w:tc>
@@ -5929,15 +5849,7 @@
         <w:spacing w:before="160" w:after="80"/>
       </w:pPr>
       <w:r>
-        <w:t xml:space="preserve">6.3 Buffer and </w:t>
-      </w:r>
-      <w:proofErr w:type="spellStart"/>
-      <w:r>
-        <w:t>AND</w:t>
-      </w:r>
-      <w:proofErr w:type="spellEnd"/>
-      <w:r>
-        <w:t xml:space="preserve"> Gate Channel Use</w:t>
+        <w:t>6.3 Buffer and AND Gate Channel Use</w:t>
       </w:r>
     </w:p>
     <w:tbl>
@@ -6700,53 +6612,22 @@
       </w:r>
       <w:r>
         <w:br/>
-        <w:t xml:space="preserve">  </w:t>
-      </w:r>
-      <w:proofErr w:type="spellStart"/>
-      <w:r>
-        <w:t>temp_logic</w:t>
-      </w:r>
-      <w:proofErr w:type="spellEnd"/>
-      <w:r>
-        <w:t xml:space="preserve">     @ 0x18</w:t>
+        <w:t xml:space="preserve">  temp_logic     @ 0x18</w:t>
       </w:r>
       <w:r>
         <w:br/>
-        <w:t xml:space="preserve">  </w:t>
-      </w:r>
-      <w:proofErr w:type="spellStart"/>
-      <w:r>
-        <w:t>temp_drive</w:t>
-      </w:r>
-      <w:proofErr w:type="spellEnd"/>
-      <w:r>
-        <w:t xml:space="preserve">     @ 0x19</w:t>
+        <w:t xml:space="preserve">  temp_drive     @ 0x19</w:t>
       </w:r>
       <w:r>
         <w:br/>
-        <w:t xml:space="preserve">  </w:t>
-      </w:r>
-      <w:proofErr w:type="spellStart"/>
-      <w:r>
-        <w:t>temp_arm_sci</w:t>
-      </w:r>
-      <w:proofErr w:type="spellEnd"/>
-      <w:r>
-        <w:t xml:space="preserve">   @ 0x1A</w:t>
+        <w:t xml:space="preserve">  temp_arm_sci   @ 0x1A</w:t>
       </w:r>
       <w:r>
         <w:br/>
       </w:r>
       <w:r>
         <w:br/>
-      </w:r>
-      <w:proofErr w:type="spellStart"/>
-      <w:r>
-        <w:t>gpio</w:t>
-      </w:r>
-      <w:proofErr w:type="spellEnd"/>
-      <w:r>
-        <w:t xml:space="preserve"> outputs:</w:t>
+        <w:t>gpio outputs:</w:t>
       </w:r>
       <w:r>
         <w:br/>
@@ -6754,46 +6635,24 @@
       </w:r>
       <w:r>
         <w:br/>
-        <w:t xml:space="preserve">  </w:t>
-      </w:r>
-      <w:proofErr w:type="spellStart"/>
-      <w:r>
-        <w:t>arm_en</w:t>
-      </w:r>
-      <w:proofErr w:type="spellEnd"/>
+        <w:t xml:space="preserve">  arm_en</w:t>
+      </w:r>
       <w:r>
         <w:br/>
-        <w:t xml:space="preserve">  </w:t>
-      </w:r>
-      <w:proofErr w:type="spellStart"/>
-      <w:r>
-        <w:t>science_en</w:t>
-      </w:r>
-      <w:proofErr w:type="spellEnd"/>
+        <w:t xml:space="preserve">  science_en</w:t>
+      </w:r>
       <w:r>
         <w:br/>
       </w:r>
       <w:r>
         <w:lastRenderedPageBreak/>
         <w:br/>
-      </w:r>
-      <w:proofErr w:type="spellStart"/>
-      <w:r>
-        <w:t>gpio</w:t>
-      </w:r>
-      <w:proofErr w:type="spellEnd"/>
-      <w:r>
-        <w:t xml:space="preserve"> inputs:</w:t>
+        <w:t>gpio inputs:</w:t>
       </w:r>
       <w:r>
         <w:br/>
-        <w:t xml:space="preserve">  </w:t>
-      </w:r>
-      <w:proofErr w:type="spellStart"/>
-      <w:r>
-        <w:t>e_stop_status</w:t>
-      </w:r>
-      <w:proofErr w:type="spellEnd"/>
+        <w:t xml:space="preserve">  e_stop_status</w:t>
+      </w:r>
       <w:r>
         <w:br/>
       </w:r>
@@ -7063,13 +6922,8 @@
         <w:spacing w:before="160" w:after="80"/>
       </w:pPr>
       <w:r>
-        <w:t xml:space="preserve">7.2 Recommended </w:t>
-      </w:r>
-      <w:proofErr w:type="spellStart"/>
-      <w:r>
-        <w:t>Stackup</w:t>
-      </w:r>
-      <w:proofErr w:type="spellEnd"/>
+        <w:t>7.2 Recommended Stackup</w:t>
+      </w:r>
     </w:p>
     <w:p>
       <w:pPr>
@@ -7508,15 +7362,7 @@
         <w:spacing w:before="160" w:after="80"/>
       </w:pPr>
       <w:r>
-        <w:t xml:space="preserve">8. </w:t>
-      </w:r>
-      <w:proofErr w:type="spellStart"/>
-      <w:r>
-        <w:t>KiCad</w:t>
-      </w:r>
-      <w:proofErr w:type="spellEnd"/>
-      <w:r>
-        <w:t xml:space="preserve"> Schematic Sheet Plan</w:t>
+        <w:t>8. KiCad Schematic Sheet Plan</w:t>
       </w:r>
     </w:p>
     <w:tbl>
@@ -8365,102 +8211,44 @@
       </w:r>
       <w:r>
         <w:br/>
-        <w:t xml:space="preserve">rail drive1 </w:t>
-      </w:r>
-      <w:proofErr w:type="spellStart"/>
-      <w:r>
-        <w:t>on|off</w:t>
-      </w:r>
-      <w:proofErr w:type="spellEnd"/>
+        <w:t>rail drive1 on|off</w:t>
+      </w:r>
       <w:r>
         <w:br/>
-        <w:t xml:space="preserve">rail drive2 </w:t>
-      </w:r>
-      <w:proofErr w:type="spellStart"/>
-      <w:r>
-        <w:t>on|off</w:t>
-      </w:r>
-      <w:proofErr w:type="spellEnd"/>
+        <w:t>rail drive2 on|off</w:t>
+      </w:r>
       <w:r>
         <w:br/>
-        <w:t xml:space="preserve">rail drive3 </w:t>
-      </w:r>
-      <w:proofErr w:type="spellStart"/>
-      <w:r>
-        <w:t>on|off</w:t>
-      </w:r>
-      <w:proofErr w:type="spellEnd"/>
+        <w:t>rail drive3 on|off</w:t>
+      </w:r>
       <w:r>
         <w:br/>
-        <w:t xml:space="preserve">rail drive4 </w:t>
-      </w:r>
-      <w:proofErr w:type="spellStart"/>
-      <w:r>
-        <w:t>on|off</w:t>
-      </w:r>
-      <w:proofErr w:type="spellEnd"/>
+        <w:t>rail drive4 on|off</w:t>
+      </w:r>
       <w:r>
         <w:br/>
-        <w:t xml:space="preserve">rail drive5 </w:t>
-      </w:r>
-      <w:proofErr w:type="spellStart"/>
-      <w:r>
-        <w:t>on|off</w:t>
-      </w:r>
-      <w:proofErr w:type="spellEnd"/>
+        <w:t>rail drive5 on|off</w:t>
+      </w:r>
       <w:r>
         <w:br/>
-        <w:t xml:space="preserve">rail drive6 </w:t>
-      </w:r>
-      <w:proofErr w:type="spellStart"/>
-      <w:r>
-        <w:t>on|off</w:t>
-      </w:r>
-      <w:proofErr w:type="spellEnd"/>
+        <w:t>rail drive6 on|off</w:t>
+      </w:r>
       <w:r>
         <w:br/>
-        <w:t xml:space="preserve">rail </w:t>
-      </w:r>
-      <w:proofErr w:type="spellStart"/>
-      <w:r>
-        <w:t>drive_all</w:t>
-      </w:r>
-      <w:proofErr w:type="spellEnd"/>
-      <w:r>
-        <w:t xml:space="preserve"> </w:t>
-      </w:r>
-      <w:proofErr w:type="spellStart"/>
-      <w:r>
-        <w:t>on|off</w:t>
-      </w:r>
-      <w:proofErr w:type="spellEnd"/>
+        <w:t>rail drive_all on|off</w:t>
+      </w:r>
       <w:r>
         <w:br/>
-        <w:t xml:space="preserve">rail arm </w:t>
-      </w:r>
-      <w:proofErr w:type="spellStart"/>
-      <w:r>
-        <w:t>on|off</w:t>
-      </w:r>
-      <w:proofErr w:type="spellEnd"/>
+        <w:t>rail arm on|off</w:t>
+      </w:r>
       <w:r>
         <w:br/>
-        <w:t xml:space="preserve">rail science </w:t>
-      </w:r>
-      <w:proofErr w:type="spellStart"/>
-      <w:r>
-        <w:t>on|off</w:t>
-      </w:r>
-      <w:proofErr w:type="spellEnd"/>
+        <w:t>rail science on|off</w:t>
+      </w:r>
       <w:r>
         <w:br/>
-        <w:t xml:space="preserve">rail aux22 </w:t>
-      </w:r>
-      <w:proofErr w:type="spellStart"/>
-      <w:r>
-        <w:t>on|off</w:t>
-      </w:r>
-      <w:proofErr w:type="spellEnd"/>
+        <w:t>rail aux22 on|off</w:t>
+      </w:r>
     </w:p>
     <w:p>
       <w:pPr>
@@ -8504,15 +8292,7 @@
         <w:spacing w:after="60"/>
       </w:pPr>
       <w:r>
-        <w:t xml:space="preserve">Run GPIO self-test into buffers and </w:t>
-      </w:r>
-      <w:proofErr w:type="spellStart"/>
-      <w:r>
-        <w:t>AND</w:t>
-      </w:r>
-      <w:proofErr w:type="spellEnd"/>
-      <w:r>
-        <w:t xml:space="preserve"> gates with no power stages populated if possible.</w:t>
+        <w:t>Run GPIO self-test into buffers and AND gates with no power stages populated if possible.</w:t>
       </w:r>
     </w:p>
     <w:p>
@@ -8657,15 +8437,7 @@
         <w:spacing w:after="60"/>
       </w:pPr>
       <w:r>
-        <w:t xml:space="preserve">Every symbol exists in </w:t>
-      </w:r>
-      <w:proofErr w:type="spellStart"/>
-      <w:r>
-        <w:t>KiCad</w:t>
-      </w:r>
-      <w:proofErr w:type="spellEnd"/>
-      <w:r>
-        <w:t xml:space="preserve"> and matches the datasheet pinout.</w:t>
+        <w:t>Every symbol exists in KiCad and matches the datasheet pinout.</w:t>
       </w:r>
     </w:p>
     <w:p>
@@ -8674,15 +8446,7 @@
         <w:spacing w:after="60"/>
       </w:pPr>
       <w:r>
-        <w:t xml:space="preserve">Every footprint exists in </w:t>
-      </w:r>
-      <w:proofErr w:type="spellStart"/>
-      <w:r>
-        <w:t>KiCad</w:t>
-      </w:r>
-      <w:proofErr w:type="spellEnd"/>
-      <w:r>
-        <w:t xml:space="preserve"> and matches the manufacturer land pattern.</w:t>
+        <w:t>Every footprint exists in KiCad and matches the manufacturer land pattern.</w:t>
       </w:r>
     </w:p>
     <w:p>
@@ -8943,15 +8707,7 @@
         <w:spacing w:after="60"/>
       </w:pPr>
       <w:r>
-        <w:t xml:space="preserve">Firmware implements </w:t>
-      </w:r>
-      <w:proofErr w:type="spellStart"/>
-      <w:r>
-        <w:t>high_power</w:t>
-      </w:r>
-      <w:proofErr w:type="spellEnd"/>
-      <w:r>
-        <w:t xml:space="preserve"> disable command.</w:t>
+        <w:t>Firmware implements high_power disable command.</w:t>
       </w:r>
     </w:p>
     <w:p>
@@ -9175,15 +8931,7 @@
           </w:tcPr>
           <w:p>
             <w:r>
-              <w:t xml:space="preserve">Compare final controller sheet against Raspberry Pi official minimal design and the Bronco Space Lab </w:t>
-            </w:r>
-            <w:proofErr w:type="spellStart"/>
-            <w:r>
-              <w:t>BLVLink</w:t>
-            </w:r>
-            <w:proofErr w:type="spellEnd"/>
-            <w:r>
-              <w:t xml:space="preserve"> hardware v2.0 reference design before PCB routing.</w:t>
+              <w:t>Compare final controller sheet against Raspberry Pi official minimal design and the Bronco Space Lab BLVLink hardware v2.0 reference design before PCB routing.</w:t>
             </w:r>
           </w:p>
         </w:tc>
@@ -9360,23 +9108,7 @@
                   <w:color w:val="0563C1"/>
                   <w:u w:val="single"/>
                 </w:rPr>
-                <w:t xml:space="preserve">Bronco Space Lab </w:t>
-              </w:r>
-              <w:proofErr w:type="spellStart"/>
-              <w:r>
-                <w:rPr>
-                  <w:color w:val="0563C1"/>
-                  <w:u w:val="single"/>
-                </w:rPr>
-                <w:t>BLVLink</w:t>
-              </w:r>
-              <w:proofErr w:type="spellEnd"/>
-              <w:r>
-                <w:rPr>
-                  <w:color w:val="0563C1"/>
-                  <w:u w:val="single"/>
-                </w:rPr>
-                <w:t xml:space="preserve"> hardware v2.0 GitHub repository</w:t>
+                <w:t>Bronco Space Lab BLVLink hardware v2.0 GitHub repository</w:t>
               </w:r>
             </w:hyperlink>
           </w:p>
@@ -9387,15 +9119,7 @@
           </w:tcPr>
           <w:p>
             <w:r>
-              <w:t xml:space="preserve">RP2350 reference design cross-check. Use this repository to compare the custom controller sheet against known RP2350 support circuitry, including MCU schematic structure, USB, flash, crystal, SWD, BOOTSEL/RUN, and </w:t>
-            </w:r>
-            <w:proofErr w:type="spellStart"/>
-            <w:r>
-              <w:t>KiCad</w:t>
-            </w:r>
-            <w:proofErr w:type="spellEnd"/>
-            <w:r>
-              <w:t xml:space="preserve"> project organization before PCB routing.</w:t>
+              <w:t>RP2350 reference design cross-check. Use this repository to compare the custom controller sheet against known RP2350 support circuitry, including MCU schematic structure, USB, flash, crystal, SWD, BOOTSEL/RUN, and KiCad project organization before PCB routing.</w:t>
             </w:r>
           </w:p>
         </w:tc>
@@ -9626,13 +9350,8 @@
             <w:tcW w:w="5256" w:type="dxa"/>
           </w:tcPr>
           <w:p>
-            <w:proofErr w:type="spellStart"/>
-            <w:r>
-              <w:t>Abracon</w:t>
-            </w:r>
-            <w:proofErr w:type="spellEnd"/>
-            <w:r>
-              <w:t xml:space="preserve"> ABM8-272-T3 listing</w:t>
+            <w:r>
+              <w:t>Abracon ABM8-272-T3 listing</w:t>
             </w:r>
           </w:p>
         </w:tc>

</xml_diff>